<commit_message>
docs(report): correct faculty format and validation claims
</commit_message>
<xml_diff>
--- a/docs/VoxFlow_Final_Project_Report.docx
+++ b/docs/VoxFlow_Final_Project_Report.docx
@@ -165,8 +165,8 @@
     </w:p>
     <w:p>
       <w:pPr>
-        <w:spacing w:line="300" w:lineRule="auto" w:after="40"/>
-        <w:ind w:firstLine="576"/>
+        <w:spacing w:line="360" w:lineRule="auto" w:after="40"/>
+        <w:ind w:firstLine="720"/>
         <w:jc w:val="both"/>
       </w:pPr>
       <w:r>
@@ -174,13 +174,13 @@
           <w:rFonts w:ascii="Times New Roman" w:hAnsi="Times New Roman"/>
           <w:sz w:val="24"/>
         </w:rPr>
-        <w:t>Speech disfluencies, such as repetitions, prolongations, and blocks, interrupt the smooth, natural rhythm of verbal expression. In clinical speech therapy, tracking therapeutic progress requires clinicians to listen to recorded sessions and manually tally disfluent events by hand. This manual counting is time-consuming, mentally demanding, and susceptible to inter-rater variability. While self-supervised speech representations have recently advanced automated stuttering detection, existing research focuses almost exclusively on classifying isolated 3-second audio clips without addressing the end-to-end engineering challenges of dedicated hardware capture, error-checked serial transport, continuous multi-window session inference, temporal event consolidation, and persistent historical tracking.</w:t>
+        <w:t>Speech disfluencies, such as repetitions, prolongations, and blocks, interrupt the smooth, natural rhythm of verbal expression. In speech therapy, tracking progress over time requires therapists to listen to recorded sessions and manually tally disfluent events by hand. This manual counting is time-consuming, mentally demanding, and susceptible to inter-rater variability. While self-supervised speech representations have recently advanced automated stuttering detection, existing research focuses almost exclusively on classifying isolated 3-second audio clips without addressing the end-to-end engineering challenges of dedicated hardware capture, error-checked serial transport, continuous multi-window session inference, temporal event consolidation, and persistent historical tracking.</w:t>
       </w:r>
     </w:p>
     <w:p>
       <w:pPr>
-        <w:spacing w:line="300" w:lineRule="auto" w:after="40"/>
-        <w:ind w:firstLine="576"/>
+        <w:spacing w:line="360" w:lineRule="auto" w:after="40"/>
+        <w:ind w:firstLine="720"/>
         <w:jc w:val="both"/>
       </w:pPr>
       <w:r>
@@ -188,7 +188,7 @@
           <w:rFonts w:ascii="Times New Roman" w:hAnsi="Times New Roman"/>
           <w:sz w:val="24"/>
         </w:rPr>
-        <w:t>VoxFlow is an end-to-end speech fluency session analyzer designed to bridge this research gap. The system consists of an embedded hardware capture unit built on an ESP32 microcontroller and an INMP441 MEMS digital microphone recording 16 kHz, 16-bit mono PCM audio. Audio frames are streamed over USB-UART using a custom-engineered framed binary protocol (VXF1) equipped with 32-bit sequence tracking and CRC32 payload verification. A Python serial bridge reconstructs session WAV files and dispatches them to a Flask REST backend. The backend executes multi-label disfluency classification using HuBERT-D, a fine-tuned HuBERT Transformer evaluated on speaker-exclusive partitions of SEP-28k and FluencyBank (519 unique speakers). Temporal event aggregation consolidates overlapping 3-second window inferences into distinct, non-redundant clinical disfluency events. Session results, window probabilities, and aggregate metrics are stored in a local SQLite database and visualized via an interactive Streamlit dashboard. HuBERT-D achieves a test macro F1 of 0.4599 and a mean ROC-AUC of 0.8099 on unseen speakers, outperforming wav2vec 2.0 (0.4498) and an MFCC + SVM baseline (0.3121). All 38 automated unit and integration tests pass successfully, demonstrating a robust, fully verifiable session analysis platform.</w:t>
+        <w:t>VoxFlow is an end-to-end speech fluency session analyzer designed to bridge this research gap. The system consists of an embedded hardware capture unit built on an ESP32 microcontroller and an INMP441 MEMS digital microphone recording 16 kHz, 16-bit mono PCM audio. Audio frames are streamed over USB-UART using a custom-engineered framed binary protocol (VXF1) equipped with 32-bit sequence tracking and CRC32 payload verification. A Python serial bridge reconstructs session WAV files and dispatches them to a Flask REST backend. The backend executes multi-label disfluency classification using HuBERT-D, a fine-tuned HuBERT Transformer evaluated on speaker-exclusive partitions of SEP-28k and FluencyBank (519 unique speakers). Temporal event aggregation consolidates overlapping 3-second window inferences into distinct, non-redundant detected disfluency events. Session results, window probabilities, and aggregate metrics are stored in a local SQLite database and visualized via an interactive Streamlit dashboard. HuBERT-D achieves a test macro F1 of 0.4599 and a mean ROC-AUC of 0.8099 on unseen speakers, outperforming wav2vec 2.0 (0.4498) and an MFCC + SVM baseline (0.3121). All 38 automated unit and integration tests pass successfully, demonstrating a robust, fully verifiable session analysis platform. VoxFlow is a research prototype and is not a medical diagnostic system.</w:t>
       </w:r>
     </w:p>
     <w:p>
@@ -224,8 +224,8 @@
     </w:p>
     <w:p>
       <w:pPr>
-        <w:spacing w:line="300" w:lineRule="auto" w:after="40"/>
-        <w:ind w:firstLine="576"/>
+        <w:spacing w:line="360" w:lineRule="auto" w:after="40"/>
+        <w:ind w:firstLine="720"/>
         <w:jc w:val="both"/>
       </w:pPr>
       <w:r>
@@ -233,13 +233,13 @@
           <w:rFonts w:ascii="Times New Roman" w:hAnsi="Times New Roman"/>
           <w:sz w:val="24"/>
         </w:rPr>
-        <w:t>Stuttering is a neurodevelopmental speech disorder characterized by frequent disruptions in the forward flow of verbal expression. Clinically, disfluent speech patterns are categorized into three core behaviors: repetitions (involuntary iterations of sounds, syllables, or single-syllable words), prolongations (abnormal lengthening of continuous phonetic segments), and blocks (silent or audible postural fixations where airflow and vocalization are temporarily arrested). Stuttering affects approximately 1% of the global adult population and up to 5% of young children, impacting social communication, academic engagement, and emotional well-being.</w:t>
+        <w:t>Stuttering is a neurodevelopmental speech condition characterized by frequent disruptions in the forward flow of verbal expression. Disfluent speech patterns are commonly categorized into three core behaviors: repetitions (involuntary iterations of sounds, syllables, or single-syllable words), prolongations (abnormal lengthening of continuous phonetic segments), and blocks (silent or audible postural fixations where airflow and vocalization are temporarily arrested). Stuttering affects approximately 1% of the global adult population and up to 5% of young children, impacting social communication, academic engagement, and emotional well-being.</w:t>
       </w:r>
     </w:p>
     <w:p>
       <w:pPr>
-        <w:spacing w:line="300" w:lineRule="auto" w:after="40"/>
-        <w:ind w:firstLine="576"/>
+        <w:spacing w:line="360" w:lineRule="auto" w:after="40"/>
+        <w:ind w:firstLine="720"/>
         <w:jc w:val="both"/>
       </w:pPr>
       <w:r>
@@ -247,7 +247,7 @@
           <w:rFonts w:ascii="Times New Roman" w:hAnsi="Times New Roman"/>
           <w:sz w:val="24"/>
         </w:rPr>
-        <w:t>Speech-language pathologists (SLPs) track therapeutic progress across multi-week interventions by evaluating disfluency frequency and severity during structured speech sessions. In standard clinical practice, therapists manually annotate audio or video recordings, tallying individual disfluency occurrences to compute standardized metrics such as the Percentage of Stuttered Syllables (%SS) and Stuttering Severity Instrument (SSI) scores. However, manual perceptual evaluation is labor-intensive, exhausting, and prone to substantial subjective disagreement across raters [1]. Recent advances in computational speech processing have introduced machine learning models for automated disfluency detection using publicly available corpora such as SEP-28k [2] and FluencyBank [3]. Nevertheless, the vast majority of existing academic literature remains confined to classifying isolated 3-second audio clips, leaving an unaddressed engineering gap between algorithmic clip classification and continuous, hardware-integrated clinical session analysis.</w:t>
+        <w:t>Speech-language pathologists (SLPs) track progress across multi-week interventions by evaluating disfluency frequency and severity during structured speech sessions. In standard practice, therapists listen to audio or video recordings and tally individual disfluency occurrences to compute metrics such as the Percentage of Stuttered Syllables (%SS) and Stuttering Severity Instrument (SSI) scores. However, manual perceptual evaluation is labor-intensive, exhausting, and prone to subjective disagreement across raters [1]. Recent advances in computational speech processing have introduced machine learning models for automated disfluency detection using publicly available corpora such as SEP-28k [2] and FluencyBank [3]. Nevertheless, the vast majority of existing academic literature remains confined to classifying isolated 3-second audio clips, leaving an unaddressed engineering gap between algorithmic clip classification and continuous, hardware-integrated session analysis.</w:t>
       </w:r>
     </w:p>
     <w:p>
@@ -267,8 +267,8 @@
     </w:p>
     <w:p>
       <w:pPr>
-        <w:spacing w:line="300" w:lineRule="auto" w:after="40"/>
-        <w:ind w:firstLine="576"/>
+        <w:spacing w:line="360" w:lineRule="auto" w:after="40"/>
+        <w:ind w:firstLine="720"/>
         <w:jc w:val="both"/>
       </w:pPr>
       <w:r>
@@ -281,8 +281,8 @@
     </w:p>
     <w:p>
       <w:pPr>
-        <w:spacing w:line="300" w:lineRule="auto" w:after="20"/>
-        <w:ind w:left="504" w:hanging="288"/>
+        <w:spacing w:line="360" w:lineRule="auto" w:after="20"/>
+        <w:ind w:left="720" w:hanging="360"/>
         <w:jc w:val="both"/>
       </w:pPr>
       <w:r>
@@ -311,8 +311,8 @@
     </w:p>
     <w:p>
       <w:pPr>
-        <w:spacing w:line="300" w:lineRule="auto" w:after="20"/>
-        <w:ind w:left="504" w:hanging="288"/>
+        <w:spacing w:line="360" w:lineRule="auto" w:after="20"/>
+        <w:ind w:left="720" w:hanging="360"/>
         <w:jc w:val="both"/>
       </w:pPr>
       <w:r>
@@ -341,8 +341,8 @@
     </w:p>
     <w:p>
       <w:pPr>
-        <w:spacing w:line="300" w:lineRule="auto" w:after="20"/>
-        <w:ind w:left="504" w:hanging="288"/>
+        <w:spacing w:line="360" w:lineRule="auto" w:after="20"/>
+        <w:ind w:left="720" w:hanging="360"/>
         <w:jc w:val="both"/>
       </w:pPr>
       <w:r>
@@ -371,8 +371,8 @@
     </w:p>
     <w:p>
       <w:pPr>
-        <w:spacing w:line="300" w:lineRule="auto" w:after="20"/>
-        <w:ind w:left="504" w:hanging="288"/>
+        <w:spacing w:line="360" w:lineRule="auto" w:after="20"/>
+        <w:ind w:left="720" w:hanging="360"/>
         <w:jc w:val="both"/>
       </w:pPr>
       <w:r>
@@ -396,13 +396,13 @@
           <w:rFonts w:ascii="Times New Roman" w:hAnsi="Times New Roman"/>
           <w:sz w:val="24"/>
         </w:rPr>
-        <w:t>A temporal event aggregation algorithm merges contiguous and proximate window activations (within a 1.5-second merge gap) into unified, non-redundant clinical events.</w:t>
+        <w:t>A temporal event aggregation algorithm merges contiguous and proximate window activations (within a 1.5-second merge gap) into unified, non-redundant detected disfluency events.</w:t>
       </w:r>
     </w:p>
     <w:p>
       <w:pPr>
-        <w:spacing w:line="300" w:lineRule="auto" w:after="20"/>
-        <w:ind w:left="504" w:hanging="288"/>
+        <w:spacing w:line="360" w:lineRule="auto" w:after="20"/>
+        <w:ind w:left="720" w:hanging="360"/>
         <w:jc w:val="both"/>
       </w:pPr>
       <w:r>
@@ -431,8 +431,8 @@
     </w:p>
     <w:p>
       <w:pPr>
-        <w:spacing w:line="300" w:lineRule="auto" w:after="20"/>
-        <w:ind w:left="504" w:hanging="288"/>
+        <w:spacing w:line="360" w:lineRule="auto" w:after="20"/>
+        <w:ind w:left="720" w:hanging="360"/>
         <w:jc w:val="both"/>
       </w:pPr>
       <w:r>
@@ -476,8 +476,8 @@
     </w:p>
     <w:p>
       <w:pPr>
-        <w:spacing w:line="300" w:lineRule="auto" w:after="40"/>
-        <w:ind w:firstLine="576"/>
+        <w:spacing w:line="360" w:lineRule="auto" w:after="40"/>
+        <w:ind w:firstLine="720"/>
         <w:jc w:val="both"/>
       </w:pPr>
       <w:r>
@@ -490,8 +490,8 @@
     </w:p>
     <w:p>
       <w:pPr>
-        <w:spacing w:line="300" w:lineRule="auto" w:after="20"/>
-        <w:ind w:left="504" w:hanging="288"/>
+        <w:spacing w:line="360" w:lineRule="auto" w:after="20"/>
+        <w:ind w:left="720" w:hanging="360"/>
         <w:jc w:val="both"/>
       </w:pPr>
       <w:r>
@@ -520,8 +520,8 @@
     </w:p>
     <w:p>
       <w:pPr>
-        <w:spacing w:line="300" w:lineRule="auto" w:after="20"/>
-        <w:ind w:left="504" w:hanging="288"/>
+        <w:spacing w:line="360" w:lineRule="auto" w:after="20"/>
+        <w:ind w:left="720" w:hanging="360"/>
         <w:jc w:val="both"/>
       </w:pPr>
       <w:r>
@@ -550,8 +550,8 @@
     </w:p>
     <w:p>
       <w:pPr>
-        <w:spacing w:line="300" w:lineRule="auto" w:after="20"/>
-        <w:ind w:left="504" w:hanging="288"/>
+        <w:spacing w:line="360" w:lineRule="auto" w:after="20"/>
+        <w:ind w:left="720" w:hanging="360"/>
         <w:jc w:val="both"/>
       </w:pPr>
       <w:r>
@@ -580,8 +580,8 @@
     </w:p>
     <w:p>
       <w:pPr>
-        <w:spacing w:line="300" w:lineRule="auto" w:after="20"/>
-        <w:ind w:left="504" w:hanging="288"/>
+        <w:spacing w:line="360" w:lineRule="auto" w:after="20"/>
+        <w:ind w:left="720" w:hanging="360"/>
         <w:jc w:val="both"/>
       </w:pPr>
       <w:r>
@@ -605,7 +605,7 @@
           <w:rFonts w:ascii="Times New Roman" w:hAnsi="Times New Roman"/>
           <w:sz w:val="24"/>
         </w:rPr>
-        <w:t>Develop a temporal event aggregator to prevent multi-counting across overlapping analysis windows, backed by relational database persistence and an intuitive clinical dashboard for session review and longitudinal trend analysis.</w:t>
+        <w:t>Develop a temporal event aggregator to prevent multi-counting across overlapping analysis windows, backed by relational database persistence and an intuitive dashboard for session review and longitudinal trend analysis.</w:t>
       </w:r>
     </w:p>
     <w:p>
@@ -640,8 +640,8 @@
     </w:p>
     <w:p>
       <w:pPr>
-        <w:spacing w:line="300" w:lineRule="auto" w:after="40"/>
-        <w:ind w:firstLine="576"/>
+        <w:spacing w:line="360" w:lineRule="auto" w:after="40"/>
+        <w:ind w:firstLine="720"/>
         <w:jc w:val="both"/>
       </w:pPr>
       <w:r>
@@ -649,13 +649,13 @@
           <w:rFonts w:ascii="Times New Roman" w:hAnsi="Times New Roman"/>
           <w:sz w:val="24"/>
         </w:rPr>
-        <w:t>Tracking speech fluency over longitudinal therapeutic interventions requires repeated speech assessments. In current clinical and therapeutic workflows, clinicians and speech therapists must manually listen to recorded sessions and hand-count individual repetitions, prolongations, and blocks. This manual observation demands substantial clinical time, imposes a heavy cognitive workload, and complicates objective comparison of patient progress across consecutive weeks.</w:t>
+        <w:t>Tracking speech fluency over longitudinal therapeutic interventions requires repeated speech assessments. In current therapeutic workflows, clinicians and speech therapists must manually listen to recorded sessions and hand-count individual repetitions, prolongations, and blocks. This manual observation demands substantial time, imposes a heavy cognitive workload, and complicates objective comparison of patient progress across consecutive weeks.</w:t>
       </w:r>
     </w:p>
     <w:p>
       <w:pPr>
-        <w:spacing w:line="300" w:lineRule="auto" w:after="40"/>
-        <w:ind w:firstLine="576"/>
+        <w:spacing w:line="360" w:lineRule="auto" w:after="40"/>
+        <w:ind w:firstLine="720"/>
         <w:jc w:val="both"/>
       </w:pPr>
       <w:r>
@@ -683,8 +683,8 @@
     </w:p>
     <w:p>
       <w:pPr>
-        <w:spacing w:line="300" w:lineRule="auto" w:after="40"/>
-        <w:ind w:firstLine="576"/>
+        <w:spacing w:line="360" w:lineRule="auto" w:after="40"/>
+        <w:ind w:firstLine="720"/>
         <w:jc w:val="both"/>
       </w:pPr>
       <w:r>
@@ -697,8 +697,8 @@
     </w:p>
     <w:p>
       <w:pPr>
-        <w:spacing w:line="300" w:lineRule="auto" w:after="20"/>
-        <w:ind w:left="504" w:hanging="288"/>
+        <w:spacing w:line="360" w:lineRule="auto" w:after="20"/>
+        <w:ind w:left="720" w:hanging="360"/>
         <w:jc w:val="both"/>
       </w:pPr>
       <w:r>
@@ -727,8 +727,8 @@
     </w:p>
     <w:p>
       <w:pPr>
-        <w:spacing w:line="300" w:lineRule="auto" w:after="20"/>
-        <w:ind w:left="504" w:hanging="288"/>
+        <w:spacing w:line="360" w:lineRule="auto" w:after="20"/>
+        <w:ind w:left="720" w:hanging="360"/>
         <w:jc w:val="both"/>
       </w:pPr>
       <w:r>
@@ -757,8 +757,8 @@
     </w:p>
     <w:p>
       <w:pPr>
-        <w:spacing w:line="300" w:lineRule="auto" w:after="20"/>
-        <w:ind w:left="504" w:hanging="288"/>
+        <w:spacing w:line="360" w:lineRule="auto" w:after="20"/>
+        <w:ind w:left="720" w:hanging="360"/>
         <w:jc w:val="both"/>
       </w:pPr>
       <w:r>
@@ -787,8 +787,8 @@
     </w:p>
     <w:p>
       <w:pPr>
-        <w:spacing w:line="300" w:lineRule="auto" w:after="20"/>
-        <w:ind w:left="504" w:hanging="288"/>
+        <w:spacing w:line="360" w:lineRule="auto" w:after="20"/>
+        <w:ind w:left="720" w:hanging="360"/>
         <w:jc w:val="both"/>
       </w:pPr>
       <w:r>
@@ -817,8 +817,8 @@
     </w:p>
     <w:p>
       <w:pPr>
-        <w:spacing w:line="300" w:lineRule="auto" w:after="20"/>
-        <w:ind w:left="504" w:hanging="288"/>
+        <w:spacing w:line="360" w:lineRule="auto" w:after="20"/>
+        <w:ind w:left="720" w:hanging="360"/>
         <w:jc w:val="both"/>
       </w:pPr>
       <w:r>
@@ -842,7 +842,7 @@
           <w:rFonts w:ascii="Times New Roman" w:hAnsi="Times New Roman"/>
           <w:sz w:val="24"/>
         </w:rPr>
-        <w:t>Academic prototypes rarely incorporate persistent database storage or clinical dashboard interfaces for tracking fluency trends across multiple sessions.</w:t>
+        <w:t>Academic prototypes rarely incorporate persistent database storage or dashboard interfaces for tracking fluency trends across multiple sessions.</w:t>
       </w:r>
     </w:p>
     <w:p>
@@ -862,8 +862,8 @@
     </w:p>
     <w:p>
       <w:pPr>
-        <w:spacing w:line="300" w:lineRule="auto" w:after="40"/>
-        <w:ind w:firstLine="576"/>
+        <w:spacing w:line="360" w:lineRule="auto" w:after="40"/>
+        <w:ind w:firstLine="720"/>
         <w:jc w:val="both"/>
       </w:pPr>
       <w:r>
@@ -891,8 +891,8 @@
     </w:p>
     <w:p>
       <w:pPr>
-        <w:spacing w:line="300" w:lineRule="auto" w:after="40"/>
-        <w:ind w:firstLine="576"/>
+        <w:spacing w:line="360" w:lineRule="auto" w:after="40"/>
+        <w:ind w:firstLine="720"/>
         <w:jc w:val="both"/>
       </w:pPr>
       <w:r>
@@ -905,8 +905,8 @@
     </w:p>
     <w:p>
       <w:pPr>
-        <w:spacing w:line="300" w:lineRule="auto" w:after="20"/>
-        <w:ind w:left="504" w:hanging="288"/>
+        <w:spacing w:line="360" w:lineRule="auto" w:after="20"/>
+        <w:ind w:left="720" w:hanging="360"/>
         <w:jc w:val="both"/>
       </w:pPr>
       <w:r>
@@ -935,8 +935,8 @@
     </w:p>
     <w:p>
       <w:pPr>
-        <w:spacing w:line="300" w:lineRule="auto" w:after="20"/>
-        <w:ind w:left="504" w:hanging="288"/>
+        <w:spacing w:line="360" w:lineRule="auto" w:after="20"/>
+        <w:ind w:left="720" w:hanging="360"/>
         <w:jc w:val="both"/>
       </w:pPr>
       <w:r>
@@ -965,8 +965,8 @@
     </w:p>
     <w:p>
       <w:pPr>
-        <w:spacing w:line="300" w:lineRule="auto" w:after="20"/>
-        <w:ind w:left="504" w:hanging="288"/>
+        <w:spacing w:line="360" w:lineRule="auto" w:after="20"/>
+        <w:ind w:left="720" w:hanging="360"/>
         <w:jc w:val="both"/>
       </w:pPr>
       <w:r>
@@ -990,13 +990,13 @@
           <w:rFonts w:ascii="Times New Roman" w:hAnsi="Times New Roman"/>
           <w:sz w:val="24"/>
         </w:rPr>
-        <w:t>Formulated an algorithmic consolidation mechanism that clusters overlapping window detections within a 1.5-second gap into single, bounded clinical events.</w:t>
+        <w:t>Formulated an algorithmic consolidation mechanism that clusters overlapping window detections within a 1.5-second gap into single, bounded detected disfluency events.</w:t>
       </w:r>
     </w:p>
     <w:p>
       <w:pPr>
-        <w:spacing w:line="300" w:lineRule="auto" w:after="20"/>
-        <w:ind w:left="504" w:hanging="288"/>
+        <w:spacing w:line="360" w:lineRule="auto" w:after="20"/>
+        <w:ind w:left="720" w:hanging="360"/>
         <w:jc w:val="both"/>
       </w:pPr>
       <w:r>
@@ -1055,8 +1055,8 @@
     </w:p>
     <w:p>
       <w:pPr>
-        <w:spacing w:line="300" w:lineRule="auto" w:after="40"/>
-        <w:ind w:firstLine="576"/>
+        <w:spacing w:line="360" w:lineRule="auto" w:after="40"/>
+        <w:ind w:firstLine="720"/>
         <w:jc w:val="both"/>
       </w:pPr>
       <w:r>
@@ -1069,7 +1069,7 @@
     </w:p>
     <w:p>
       <w:pPr>
-        <w:spacing w:line="288" w:lineRule="auto" w:before="60" w:after="40"/>
+        <w:spacing w:line="360" w:lineRule="auto" w:before="80" w:after="40"/>
         <w:ind w:firstLine="0"/>
         <w:jc w:val="both"/>
       </w:pPr>
@@ -1077,7 +1077,7 @@
         <w:rPr>
           <w:rFonts w:ascii="Times New Roman" w:hAnsi="Times New Roman"/>
           <w:b/>
-          <w:sz w:val="22"/>
+          <w:sz w:val="24"/>
         </w:rPr>
         <w:t>3.1.1 Sheikh et al. (2022) [1]</w:t>
         <w:br/>
@@ -1086,14 +1086,14 @@
         <w:rPr>
           <w:rFonts w:ascii="Times New Roman" w:hAnsi="Times New Roman"/>
           <w:b/>
-          <w:sz w:val="20"/>
+          <w:sz w:val="22"/>
         </w:rPr>
         <w:t xml:space="preserve">Problem: </w:t>
       </w:r>
       <w:r>
         <w:rPr>
           <w:rFonts w:ascii="Times New Roman" w:hAnsi="Times New Roman"/>
-          <w:sz w:val="20"/>
+          <w:sz w:val="22"/>
         </w:rPr>
         <w:t xml:space="preserve">Review machine learning techniques for stuttering identification, covering features, classifiers, datasets, and practical challenges. </w:t>
       </w:r>
@@ -1101,14 +1101,14 @@
         <w:rPr>
           <w:rFonts w:ascii="Times New Roman" w:hAnsi="Times New Roman"/>
           <w:b/>
-          <w:sz w:val="20"/>
+          <w:sz w:val="22"/>
         </w:rPr>
         <w:t xml:space="preserve">Method: </w:t>
       </w:r>
       <w:r>
         <w:rPr>
           <w:rFonts w:ascii="Times New Roman" w:hAnsi="Times New Roman"/>
-          <w:sz w:val="20"/>
+          <w:sz w:val="22"/>
         </w:rPr>
         <w:t xml:space="preserve">Systematic survey of acoustic features (MFCCs, spectrograms), classical classifiers (SVMs, GMMs), and deep neural architectures. </w:t>
       </w:r>
@@ -1116,14 +1116,14 @@
         <w:rPr>
           <w:rFonts w:ascii="Times New Roman" w:hAnsi="Times New Roman"/>
           <w:b/>
-          <w:sz w:val="20"/>
+          <w:sz w:val="22"/>
         </w:rPr>
         <w:t xml:space="preserve">Key finding: </w:t>
       </w:r>
       <w:r>
         <w:rPr>
           <w:rFonts w:ascii="Times New Roman" w:hAnsi="Times New Roman"/>
-          <w:sz w:val="20"/>
+          <w:sz w:val="22"/>
         </w:rPr>
         <w:t xml:space="preserve">Identified dataset fragmentation, lack of standardized evaluation protocols, and dominance of short-clip classification over continuous sessions. </w:t>
       </w:r>
@@ -1131,14 +1131,14 @@
         <w:rPr>
           <w:rFonts w:ascii="Times New Roman" w:hAnsi="Times New Roman"/>
           <w:b/>
-          <w:sz w:val="20"/>
+          <w:sz w:val="22"/>
         </w:rPr>
         <w:t xml:space="preserve">Limitation / gap: </w:t>
       </w:r>
       <w:r>
         <w:rPr>
           <w:rFonts w:ascii="Times New Roman" w:hAnsi="Times New Roman"/>
-          <w:sz w:val="20"/>
+          <w:sz w:val="22"/>
         </w:rPr>
         <w:t xml:space="preserve">Survey paper; did not construct an end-to-end hardware capture, session aggregation, or clinical software tool. </w:t>
       </w:r>
@@ -1146,21 +1146,21 @@
         <w:rPr>
           <w:rFonts w:ascii="Times New Roman" w:hAnsi="Times New Roman"/>
           <w:b/>
-          <w:sz w:val="20"/>
+          <w:sz w:val="22"/>
         </w:rPr>
         <w:t xml:space="preserve">Relevance to VoxFlow: </w:t>
       </w:r>
       <w:r>
         <w:rPr>
           <w:rFonts w:ascii="Times New Roman" w:hAnsi="Times New Roman"/>
-          <w:sz w:val="20"/>
+          <w:sz w:val="22"/>
         </w:rPr>
         <w:t xml:space="preserve">Validates VoxFlow's system-level objective to transition from isolated clip detection to full session tracking. </w:t>
       </w:r>
     </w:p>
     <w:p>
       <w:pPr>
-        <w:spacing w:line="288" w:lineRule="auto" w:before="60" w:after="40"/>
+        <w:spacing w:line="360" w:lineRule="auto" w:before="80" w:after="40"/>
         <w:ind w:firstLine="0"/>
         <w:jc w:val="both"/>
       </w:pPr>
@@ -1168,7 +1168,7 @@
         <w:rPr>
           <w:rFonts w:ascii="Times New Roman" w:hAnsi="Times New Roman"/>
           <w:b/>
-          <w:sz w:val="22"/>
+          <w:sz w:val="24"/>
         </w:rPr>
         <w:t>3.1.2 Lea et al. (2021) [2]</w:t>
         <w:br/>
@@ -1177,14 +1177,14 @@
         <w:rPr>
           <w:rFonts w:ascii="Times New Roman" w:hAnsi="Times New Roman"/>
           <w:b/>
-          <w:sz w:val="20"/>
+          <w:sz w:val="22"/>
         </w:rPr>
         <w:t xml:space="preserve">Problem: </w:t>
       </w:r>
       <w:r>
         <w:rPr>
           <w:rFonts w:ascii="Times New Roman" w:hAnsi="Times New Roman"/>
-          <w:sz w:val="20"/>
+          <w:sz w:val="22"/>
         </w:rPr>
         <w:t xml:space="preserve">Scarcity of large-scale, naturalistic, publicly available audio datasets for multi-class stuttering event detection. </w:t>
       </w:r>
@@ -1192,14 +1192,14 @@
         <w:rPr>
           <w:rFonts w:ascii="Times New Roman" w:hAnsi="Times New Roman"/>
           <w:b/>
-          <w:sz w:val="20"/>
+          <w:sz w:val="22"/>
         </w:rPr>
         <w:t xml:space="preserve">Method: </w:t>
       </w:r>
       <w:r>
         <w:rPr>
           <w:rFonts w:ascii="Times New Roman" w:hAnsi="Times New Roman"/>
-          <w:sz w:val="20"/>
+          <w:sz w:val="22"/>
         </w:rPr>
         <w:t xml:space="preserve">Introduced the SEP-28k dataset (28,177 3-second clips from public podcasts) annotated for repetitions, prolongations, blocks, interjections, and word repetitions. </w:t>
       </w:r>
@@ -1207,14 +1207,14 @@
         <w:rPr>
           <w:rFonts w:ascii="Times New Roman" w:hAnsi="Times New Roman"/>
           <w:b/>
-          <w:sz w:val="20"/>
+          <w:sz w:val="22"/>
         </w:rPr>
         <w:t xml:space="preserve">Key finding: </w:t>
       </w:r>
       <w:r>
         <w:rPr>
           <w:rFonts w:ascii="Times New Roman" w:hAnsi="Times New Roman"/>
-          <w:sz w:val="20"/>
+          <w:sz w:val="22"/>
         </w:rPr>
         <w:t xml:space="preserve">Demonstrated multi-label disfluency detection in conversational audio is challenging, establishing baseline classifier benchmarks. </w:t>
       </w:r>
@@ -1222,14 +1222,14 @@
         <w:rPr>
           <w:rFonts w:ascii="Times New Roman" w:hAnsi="Times New Roman"/>
           <w:b/>
-          <w:sz w:val="20"/>
+          <w:sz w:val="22"/>
         </w:rPr>
         <w:t xml:space="preserve">Limitation / gap: </w:t>
       </w:r>
       <w:r>
         <w:rPr>
           <w:rFonts w:ascii="Times New Roman" w:hAnsi="Times New Roman"/>
-          <w:sz w:val="20"/>
+          <w:sz w:val="22"/>
         </w:rPr>
         <w:t xml:space="preserve">Dataset audio is segmented into isolated 3-second clips without continuous temporal context or hardware streaming. </w:t>
       </w:r>
@@ -1237,21 +1237,21 @@
         <w:rPr>
           <w:rFonts w:ascii="Times New Roman" w:hAnsi="Times New Roman"/>
           <w:b/>
-          <w:sz w:val="20"/>
+          <w:sz w:val="22"/>
         </w:rPr>
         <w:t xml:space="preserve">Relevance to VoxFlow: </w:t>
       </w:r>
       <w:r>
         <w:rPr>
           <w:rFonts w:ascii="Times New Roman" w:hAnsi="Times New Roman"/>
-          <w:sz w:val="20"/>
+          <w:sz w:val="22"/>
         </w:rPr>
         <w:t xml:space="preserve">SEP-28k serves as the primary training and evaluation corpus for VoxFlow's HuBERT-D classifier. </w:t>
       </w:r>
     </w:p>
     <w:p>
       <w:pPr>
-        <w:spacing w:line="288" w:lineRule="auto" w:before="60" w:after="40"/>
+        <w:spacing w:line="360" w:lineRule="auto" w:before="80" w:after="40"/>
         <w:ind w:firstLine="0"/>
         <w:jc w:val="both"/>
       </w:pPr>
@@ -1259,7 +1259,7 @@
         <w:rPr>
           <w:rFonts w:ascii="Times New Roman" w:hAnsi="Times New Roman"/>
           <w:b/>
-          <w:sz w:val="22"/>
+          <w:sz w:val="24"/>
         </w:rPr>
         <w:t>3.1.3 Bernstein Ratner and MacWhinney (2018) [3]</w:t>
         <w:br/>
@@ -1268,14 +1268,14 @@
         <w:rPr>
           <w:rFonts w:ascii="Times New Roman" w:hAnsi="Times New Roman"/>
           <w:b/>
-          <w:sz w:val="20"/>
+          <w:sz w:val="22"/>
         </w:rPr>
         <w:t xml:space="preserve">Problem: </w:t>
       </w:r>
       <w:r>
         <w:rPr>
           <w:rFonts w:ascii="Times New Roman" w:hAnsi="Times New Roman"/>
-          <w:sz w:val="20"/>
+          <w:sz w:val="22"/>
         </w:rPr>
         <w:t xml:space="preserve">Absence of shared, open-access clinical archives and standardized transcripts for stuttering and speech fluency research. </w:t>
       </w:r>
@@ -1283,14 +1283,14 @@
         <w:rPr>
           <w:rFonts w:ascii="Times New Roman" w:hAnsi="Times New Roman"/>
           <w:b/>
-          <w:sz w:val="20"/>
+          <w:sz w:val="22"/>
         </w:rPr>
         <w:t xml:space="preserve">Method: </w:t>
       </w:r>
       <w:r>
         <w:rPr>
           <w:rFonts w:ascii="Times New Roman" w:hAnsi="Times New Roman"/>
-          <w:sz w:val="20"/>
+          <w:sz w:val="22"/>
         </w:rPr>
         <w:t xml:space="preserve">Established FluencyBank under the TalkBank framework, providing standardized audio recordings and clinical transcripts. </w:t>
       </w:r>
@@ -1298,14 +1298,14 @@
         <w:rPr>
           <w:rFonts w:ascii="Times New Roman" w:hAnsi="Times New Roman"/>
           <w:b/>
-          <w:sz w:val="20"/>
+          <w:sz w:val="22"/>
         </w:rPr>
         <w:t xml:space="preserve">Key finding: </w:t>
       </w:r>
       <w:r>
         <w:rPr>
           <w:rFonts w:ascii="Times New Roman" w:hAnsi="Times New Roman"/>
-          <w:sz w:val="20"/>
+          <w:sz w:val="22"/>
         </w:rPr>
         <w:t xml:space="preserve">Created an international open-access resource that enabled reproducible computational and clinical speech research. </w:t>
       </w:r>
@@ -1313,14 +1313,14 @@
         <w:rPr>
           <w:rFonts w:ascii="Times New Roman" w:hAnsi="Times New Roman"/>
           <w:b/>
-          <w:sz w:val="20"/>
+          <w:sz w:val="22"/>
         </w:rPr>
         <w:t xml:space="preserve">Limitation / gap: </w:t>
       </w:r>
       <w:r>
         <w:rPr>
           <w:rFonts w:ascii="Times New Roman" w:hAnsi="Times New Roman"/>
-          <w:sz w:val="20"/>
+          <w:sz w:val="22"/>
         </w:rPr>
         <w:t xml:space="preserve">Archival database; does not provide automated machine learning detection models or hardware capture utilities. </w:t>
       </w:r>
@@ -1328,21 +1328,21 @@
         <w:rPr>
           <w:rFonts w:ascii="Times New Roman" w:hAnsi="Times New Roman"/>
           <w:b/>
-          <w:sz w:val="20"/>
+          <w:sz w:val="22"/>
         </w:rPr>
         <w:t xml:space="preserve">Relevance to VoxFlow: </w:t>
       </w:r>
       <w:r>
         <w:rPr>
           <w:rFonts w:ascii="Times New Roman" w:hAnsi="Times New Roman"/>
-          <w:sz w:val="20"/>
+          <w:sz w:val="22"/>
         </w:rPr>
         <w:t xml:space="preserve">FluencyBank provides the secondary benchmark corpus incorporated into VoxFlow's multi-annotator training dataset. </w:t>
       </w:r>
     </w:p>
     <w:p>
       <w:pPr>
-        <w:spacing w:line="288" w:lineRule="auto" w:before="60" w:after="40"/>
+        <w:spacing w:line="360" w:lineRule="auto" w:before="80" w:after="40"/>
         <w:ind w:firstLine="0"/>
         <w:jc w:val="both"/>
       </w:pPr>
@@ -1350,7 +1350,7 @@
         <w:rPr>
           <w:rFonts w:ascii="Times New Roman" w:hAnsi="Times New Roman"/>
           <w:b/>
-          <w:sz w:val="22"/>
+          <w:sz w:val="24"/>
         </w:rPr>
         <w:t>3.1.4 Howell et al. (2009) [4]</w:t>
         <w:br/>
@@ -1359,14 +1359,14 @@
         <w:rPr>
           <w:rFonts w:ascii="Times New Roman" w:hAnsi="Times New Roman"/>
           <w:b/>
-          <w:sz w:val="20"/>
+          <w:sz w:val="22"/>
         </w:rPr>
         <w:t xml:space="preserve">Problem: </w:t>
       </w:r>
       <w:r>
         <w:rPr>
           <w:rFonts w:ascii="Times New Roman" w:hAnsi="Times New Roman"/>
-          <w:sz w:val="20"/>
+          <w:sz w:val="22"/>
         </w:rPr>
         <w:t xml:space="preserve">Need for accessible clinical recordings to analyze developmental stuttering trajectories across age cohorts. </w:t>
       </w:r>
@@ -1374,14 +1374,14 @@
         <w:rPr>
           <w:rFonts w:ascii="Times New Roman" w:hAnsi="Times New Roman"/>
           <w:b/>
-          <w:sz w:val="20"/>
+          <w:sz w:val="22"/>
         </w:rPr>
         <w:t xml:space="preserve">Method: </w:t>
       </w:r>
       <w:r>
         <w:rPr>
           <w:rFonts w:ascii="Times New Roman" w:hAnsi="Times New Roman"/>
-          <w:sz w:val="20"/>
+          <w:sz w:val="22"/>
         </w:rPr>
         <w:t xml:space="preserve">Developed the University College London Archive of Stuttered Speech (UCLASS), offering recordings and orthographic transcriptions. </w:t>
       </w:r>
@@ -1389,14 +1389,14 @@
         <w:rPr>
           <w:rFonts w:ascii="Times New Roman" w:hAnsi="Times New Roman"/>
           <w:b/>
-          <w:sz w:val="20"/>
+          <w:sz w:val="22"/>
         </w:rPr>
         <w:t xml:space="preserve">Key finding: </w:t>
       </w:r>
       <w:r>
         <w:rPr>
           <w:rFonts w:ascii="Times New Roman" w:hAnsi="Times New Roman"/>
-          <w:sz w:val="20"/>
+          <w:sz w:val="22"/>
         </w:rPr>
         <w:t xml:space="preserve">Showed acoustic differences in disfluency manifestations across age groups, establishing an early public benchmark. </w:t>
       </w:r>
@@ -1404,14 +1404,14 @@
         <w:rPr>
           <w:rFonts w:ascii="Times New Roman" w:hAnsi="Times New Roman"/>
           <w:b/>
-          <w:sz w:val="20"/>
+          <w:sz w:val="22"/>
         </w:rPr>
         <w:t xml:space="preserve">Limitation / gap: </w:t>
       </w:r>
       <w:r>
         <w:rPr>
           <w:rFonts w:ascii="Times New Roman" w:hAnsi="Times New Roman"/>
-          <w:sz w:val="20"/>
+          <w:sz w:val="22"/>
         </w:rPr>
         <w:t xml:space="preserve">Smaller dataset recorded under legacy acoustic conditions; evaluated on isolated speech tokens without modern neural models. </w:t>
       </w:r>
@@ -1419,21 +1419,21 @@
         <w:rPr>
           <w:rFonts w:ascii="Times New Roman" w:hAnsi="Times New Roman"/>
           <w:b/>
-          <w:sz w:val="20"/>
+          <w:sz w:val="22"/>
         </w:rPr>
         <w:t xml:space="preserve">Relevance to VoxFlow: </w:t>
       </w:r>
       <w:r>
         <w:rPr>
           <w:rFonts w:ascii="Times New Roman" w:hAnsi="Times New Roman"/>
-          <w:sz w:val="20"/>
+          <w:sz w:val="22"/>
         </w:rPr>
         <w:t xml:space="preserve">Provides foundational clinical taxonomy for defining repetition, prolongation, and block categories. </w:t>
       </w:r>
     </w:p>
     <w:p>
       <w:pPr>
-        <w:spacing w:line="288" w:lineRule="auto" w:before="60" w:after="40"/>
+        <w:spacing w:line="360" w:lineRule="auto" w:before="80" w:after="40"/>
         <w:ind w:firstLine="0"/>
         <w:jc w:val="both"/>
       </w:pPr>
@@ -1441,7 +1441,7 @@
         <w:rPr>
           <w:rFonts w:ascii="Times New Roman" w:hAnsi="Times New Roman"/>
           <w:b/>
-          <w:sz w:val="22"/>
+          <w:sz w:val="24"/>
         </w:rPr>
         <w:t>3.1.5 Kourkounakis et al. (2021) [5]</w:t>
         <w:br/>
@@ -1450,14 +1450,14 @@
         <w:rPr>
           <w:rFonts w:ascii="Times New Roman" w:hAnsi="Times New Roman"/>
           <w:b/>
-          <w:sz w:val="20"/>
+          <w:sz w:val="22"/>
         </w:rPr>
         <w:t xml:space="preserve">Problem: </w:t>
       </w:r>
       <w:r>
         <w:rPr>
           <w:rFonts w:ascii="Times New Roman" w:hAnsi="Times New Roman"/>
-          <w:sz w:val="20"/>
+          <w:sz w:val="22"/>
         </w:rPr>
         <w:t xml:space="preserve">Detecting multi-class stuttered disfluencies directly from spectrogram representations without manual feature engineering. </w:t>
       </w:r>
@@ -1465,14 +1465,14 @@
         <w:rPr>
           <w:rFonts w:ascii="Times New Roman" w:hAnsi="Times New Roman"/>
           <w:b/>
-          <w:sz w:val="20"/>
+          <w:sz w:val="22"/>
         </w:rPr>
         <w:t xml:space="preserve">Method: </w:t>
       </w:r>
       <w:r>
         <w:rPr>
           <w:rFonts w:ascii="Times New Roman" w:hAnsi="Times New Roman"/>
-          <w:sz w:val="20"/>
+          <w:sz w:val="22"/>
         </w:rPr>
         <w:t xml:space="preserve">Proposed FluentNet, integrating Squeeze-and-Excitation ResNet, BiLSTM layers, and attention mechanisms on log-mel spectrograms. </w:t>
       </w:r>
@@ -1480,14 +1480,14 @@
         <w:rPr>
           <w:rFonts w:ascii="Times New Roman" w:hAnsi="Times New Roman"/>
           <w:b/>
-          <w:sz w:val="20"/>
+          <w:sz w:val="22"/>
         </w:rPr>
         <w:t xml:space="preserve">Key finding: </w:t>
       </w:r>
       <w:r>
         <w:rPr>
           <w:rFonts w:ascii="Times New Roman" w:hAnsi="Times New Roman"/>
-          <w:sz w:val="20"/>
+          <w:sz w:val="22"/>
         </w:rPr>
         <w:t xml:space="preserve">Achieved 91.75% accuracy on UCLASS and 86.7% on LibriStutter, proving attention mechanisms capture disfluency boundaries. </w:t>
       </w:r>
@@ -1495,14 +1495,14 @@
         <w:rPr>
           <w:rFonts w:ascii="Times New Roman" w:hAnsi="Times New Roman"/>
           <w:b/>
-          <w:sz w:val="20"/>
+          <w:sz w:val="22"/>
         </w:rPr>
         <w:t xml:space="preserve">Limitation / gap: </w:t>
       </w:r>
       <w:r>
         <w:rPr>
           <w:rFonts w:ascii="Times New Roman" w:hAnsi="Times New Roman"/>
-          <w:sz w:val="20"/>
+          <w:sz w:val="22"/>
         </w:rPr>
         <w:t xml:space="preserve">Evaluated strictly on pre-cut audio segments; did not address streaming capture, frame transport, or session aggregation. </w:t>
       </w:r>
@@ -1510,21 +1510,21 @@
         <w:rPr>
           <w:rFonts w:ascii="Times New Roman" w:hAnsi="Times New Roman"/>
           <w:b/>
-          <w:sz w:val="20"/>
+          <w:sz w:val="22"/>
         </w:rPr>
         <w:t xml:space="preserve">Relevance to VoxFlow: </w:t>
       </w:r>
       <w:r>
         <w:rPr>
           <w:rFonts w:ascii="Times New Roman" w:hAnsi="Times New Roman"/>
-          <w:sz w:val="20"/>
+          <w:sz w:val="22"/>
         </w:rPr>
         <w:t xml:space="preserve">Confirms the importance of capturing temporal dependencies in disfluency classification, inspiring VoxFlow's windowing design. </w:t>
       </w:r>
     </w:p>
     <w:p>
       <w:pPr>
-        <w:spacing w:line="288" w:lineRule="auto" w:before="60" w:after="40"/>
+        <w:spacing w:line="360" w:lineRule="auto" w:before="80" w:after="40"/>
         <w:ind w:firstLine="0"/>
         <w:jc w:val="both"/>
       </w:pPr>
@@ -1532,7 +1532,7 @@
         <w:rPr>
           <w:rFonts w:ascii="Times New Roman" w:hAnsi="Times New Roman"/>
           <w:b/>
-          <w:sz w:val="22"/>
+          <w:sz w:val="24"/>
         </w:rPr>
         <w:t>3.1.6 Sheikh et al. (2021) [6]</w:t>
         <w:br/>
@@ -1541,14 +1541,14 @@
         <w:rPr>
           <w:rFonts w:ascii="Times New Roman" w:hAnsi="Times New Roman"/>
           <w:b/>
-          <w:sz w:val="20"/>
+          <w:sz w:val="22"/>
         </w:rPr>
         <w:t xml:space="preserve">Problem: </w:t>
       </w:r>
       <w:r>
         <w:rPr>
           <w:rFonts w:ascii="Times New Roman" w:hAnsi="Times New Roman"/>
-          <w:sz w:val="20"/>
+          <w:sz w:val="22"/>
         </w:rPr>
         <w:t xml:space="preserve">High computational complexity and inference latency of recurrent neural networks in multi-class stuttering classification. </w:t>
       </w:r>
@@ -1556,14 +1556,14 @@
         <w:rPr>
           <w:rFonts w:ascii="Times New Roman" w:hAnsi="Times New Roman"/>
           <w:b/>
-          <w:sz w:val="20"/>
+          <w:sz w:val="22"/>
         </w:rPr>
         <w:t xml:space="preserve">Method: </w:t>
       </w:r>
       <w:r>
         <w:rPr>
           <w:rFonts w:ascii="Times New Roman" w:hAnsi="Times New Roman"/>
-          <w:sz w:val="20"/>
+          <w:sz w:val="22"/>
         </w:rPr>
         <w:t xml:space="preserve">Developed StutterNet, a Time-Delay Neural Network (TDNN) architecture trained on 2D MFCC acoustic features across context frames. </w:t>
       </w:r>
@@ -1571,14 +1571,14 @@
         <w:rPr>
           <w:rFonts w:ascii="Times New Roman" w:hAnsi="Times New Roman"/>
           <w:b/>
-          <w:sz w:val="20"/>
+          <w:sz w:val="22"/>
         </w:rPr>
         <w:t xml:space="preserve">Key finding: </w:t>
       </w:r>
       <w:r>
         <w:rPr>
           <w:rFonts w:ascii="Times New Roman" w:hAnsi="Times New Roman"/>
-          <w:sz w:val="20"/>
+          <w:sz w:val="22"/>
         </w:rPr>
         <w:t xml:space="preserve">Outperformed baseline residual architectures while significantly lowering parameter counts through sub-sampled convolutions. </w:t>
       </w:r>
@@ -1586,14 +1586,14 @@
         <w:rPr>
           <w:rFonts w:ascii="Times New Roman" w:hAnsi="Times New Roman"/>
           <w:b/>
-          <w:sz w:val="20"/>
+          <w:sz w:val="22"/>
         </w:rPr>
         <w:t xml:space="preserve">Limitation / gap: </w:t>
       </w:r>
       <w:r>
         <w:rPr>
           <w:rFonts w:ascii="Times New Roman" w:hAnsi="Times New Roman"/>
-          <w:sz w:val="20"/>
+          <w:sz w:val="22"/>
         </w:rPr>
         <w:t xml:space="preserve">Operates on isolated clips with handcrafted MFCC features, which have lower representational capacity than self-supervised embeddings. </w:t>
       </w:r>
@@ -1601,21 +1601,21 @@
         <w:rPr>
           <w:rFonts w:ascii="Times New Roman" w:hAnsi="Times New Roman"/>
           <w:b/>
-          <w:sz w:val="20"/>
+          <w:sz w:val="22"/>
         </w:rPr>
         <w:t xml:space="preserve">Relevance to VoxFlow: </w:t>
       </w:r>
       <w:r>
         <w:rPr>
           <w:rFonts w:ascii="Times New Roman" w:hAnsi="Times New Roman"/>
-          <w:sz w:val="20"/>
+          <w:sz w:val="22"/>
         </w:rPr>
         <w:t xml:space="preserve">Demonstrates the feasibility of low-latency frame-level disfluency scoring and provides a baseline comparison. </w:t>
       </w:r>
     </w:p>
     <w:p>
       <w:pPr>
-        <w:spacing w:line="288" w:lineRule="auto" w:before="60" w:after="40"/>
+        <w:spacing w:line="360" w:lineRule="auto" w:before="80" w:after="40"/>
         <w:ind w:firstLine="0"/>
         <w:jc w:val="both"/>
       </w:pPr>
@@ -1623,7 +1623,7 @@
         <w:rPr>
           <w:rFonts w:ascii="Times New Roman" w:hAnsi="Times New Roman"/>
           <w:b/>
-          <w:sz w:val="22"/>
+          <w:sz w:val="24"/>
         </w:rPr>
         <w:t>3.1.7 Sheikh et al. (2023) [7]</w:t>
         <w:br/>
@@ -1632,14 +1632,14 @@
         <w:rPr>
           <w:rFonts w:ascii="Times New Roman" w:hAnsi="Times New Roman"/>
           <w:b/>
-          <w:sz w:val="20"/>
+          <w:sz w:val="22"/>
         </w:rPr>
         <w:t xml:space="preserve">Problem: </w:t>
       </w:r>
       <w:r>
         <w:rPr>
           <w:rFonts w:ascii="Times New Roman" w:hAnsi="Times New Roman"/>
-          <w:sz w:val="20"/>
+          <w:sz w:val="22"/>
         </w:rPr>
         <w:t xml:space="preserve">Severe class imbalance across disfluency types and poor generalization across unseen speaker distributions in SEP-28k. </w:t>
       </w:r>
@@ -1647,14 +1647,14 @@
         <w:rPr>
           <w:rFonts w:ascii="Times New Roman" w:hAnsi="Times New Roman"/>
           <w:b/>
-          <w:sz w:val="20"/>
+          <w:sz w:val="22"/>
         </w:rPr>
         <w:t xml:space="preserve">Method: </w:t>
       </w:r>
       <w:r>
         <w:rPr>
           <w:rFonts w:ascii="Times New Roman" w:hAnsi="Times New Roman"/>
-          <w:sz w:val="20"/>
+          <w:sz w:val="22"/>
         </w:rPr>
         <w:t xml:space="preserve">Proposed multi-contextual deep learning using SpecAugment data augmentation, class-balanced focal loss, and multi-branch features. </w:t>
       </w:r>
@@ -1662,14 +1662,14 @@
         <w:rPr>
           <w:rFonts w:ascii="Times New Roman" w:hAnsi="Times New Roman"/>
           <w:b/>
-          <w:sz w:val="20"/>
+          <w:sz w:val="22"/>
         </w:rPr>
         <w:t xml:space="preserve">Key finding: </w:t>
       </w:r>
       <w:r>
         <w:rPr>
           <w:rFonts w:ascii="Times New Roman" w:hAnsi="Times New Roman"/>
-          <w:sz w:val="20"/>
+          <w:sz w:val="22"/>
         </w:rPr>
         <w:t xml:space="preserve">Class-balanced loss functions and data augmentation significantly improved detection of minority disfluencies (blocks and prolongations). </w:t>
       </w:r>
@@ -1677,14 +1677,14 @@
         <w:rPr>
           <w:rFonts w:ascii="Times New Roman" w:hAnsi="Times New Roman"/>
           <w:b/>
-          <w:sz w:val="20"/>
+          <w:sz w:val="22"/>
         </w:rPr>
         <w:t xml:space="preserve">Limitation / gap: </w:t>
       </w:r>
       <w:r>
         <w:rPr>
           <w:rFonts w:ascii="Times New Roman" w:hAnsi="Times New Roman"/>
-          <w:sz w:val="20"/>
+          <w:sz w:val="22"/>
         </w:rPr>
         <w:t xml:space="preserve">Clip-level evaluation without physical hardware integration, serial error checking, or session-level event consolidation. </w:t>
       </w:r>
@@ -1692,21 +1692,21 @@
         <w:rPr>
           <w:rFonts w:ascii="Times New Roman" w:hAnsi="Times New Roman"/>
           <w:b/>
-          <w:sz w:val="20"/>
+          <w:sz w:val="22"/>
         </w:rPr>
         <w:t xml:space="preserve">Relevance to VoxFlow: </w:t>
       </w:r>
       <w:r>
         <w:rPr>
           <w:rFonts w:ascii="Times New Roman" w:hAnsi="Times New Roman"/>
-          <w:sz w:val="20"/>
+          <w:sz w:val="22"/>
         </w:rPr>
         <w:t xml:space="preserve">Directly motivated VoxFlow's adoption of class-weighted loss and disfluency-specific detection thresholds. </w:t>
       </w:r>
     </w:p>
     <w:p>
       <w:pPr>
-        <w:spacing w:line="288" w:lineRule="auto" w:before="60" w:after="40"/>
+        <w:spacing w:line="360" w:lineRule="auto" w:before="80" w:after="40"/>
         <w:ind w:firstLine="0"/>
         <w:jc w:val="both"/>
       </w:pPr>
@@ -1714,7 +1714,7 @@
         <w:rPr>
           <w:rFonts w:ascii="Times New Roman" w:hAnsi="Times New Roman"/>
           <w:b/>
-          <w:sz w:val="22"/>
+          <w:sz w:val="24"/>
         </w:rPr>
         <w:t>3.1.8 Bayerl et al. (2022a) [8]</w:t>
         <w:br/>
@@ -1723,14 +1723,14 @@
         <w:rPr>
           <w:rFonts w:ascii="Times New Roman" w:hAnsi="Times New Roman"/>
           <w:b/>
-          <w:sz w:val="20"/>
+          <w:sz w:val="22"/>
         </w:rPr>
         <w:t xml:space="preserve">Problem: </w:t>
       </w:r>
       <w:r>
         <w:rPr>
           <w:rFonts w:ascii="Times New Roman" w:hAnsi="Times New Roman"/>
-          <w:sz w:val="20"/>
+          <w:sz w:val="22"/>
         </w:rPr>
         <w:t xml:space="preserve">Scarcity of clinical therapy datasets capturing deliberate fluency-shaping techniques alongside natural disfluencies. </w:t>
       </w:r>
@@ -1738,14 +1738,14 @@
         <w:rPr>
           <w:rFonts w:ascii="Times New Roman" w:hAnsi="Times New Roman"/>
           <w:b/>
-          <w:sz w:val="20"/>
+          <w:sz w:val="22"/>
         </w:rPr>
         <w:t xml:space="preserve">Method: </w:t>
       </w:r>
       <w:r>
         <w:rPr>
           <w:rFonts w:ascii="Times New Roman" w:hAnsi="Times New Roman"/>
-          <w:sz w:val="20"/>
+          <w:sz w:val="22"/>
         </w:rPr>
         <w:t xml:space="preserve">Constructed the Kassel State of Fluency (KSoF) dataset, consisting of German speech recordings annotated by professional speech therapists. </w:t>
       </w:r>
@@ -1753,14 +1753,14 @@
         <w:rPr>
           <w:rFonts w:ascii="Times New Roman" w:hAnsi="Times New Roman"/>
           <w:b/>
-          <w:sz w:val="20"/>
+          <w:sz w:val="22"/>
         </w:rPr>
         <w:t xml:space="preserve">Key finding: </w:t>
       </w:r>
       <w:r>
         <w:rPr>
           <w:rFonts w:ascii="Times New Roman" w:hAnsi="Times New Roman"/>
-          <w:sz w:val="20"/>
+          <w:sz w:val="22"/>
         </w:rPr>
         <w:t xml:space="preserve">Showed that clinical evaluation requires fine-grained disfluency categorization rather than binary fluent/disfluent discrimination. </w:t>
       </w:r>
@@ -1768,14 +1768,14 @@
         <w:rPr>
           <w:rFonts w:ascii="Times New Roman" w:hAnsi="Times New Roman"/>
           <w:b/>
-          <w:sz w:val="20"/>
+          <w:sz w:val="22"/>
         </w:rPr>
         <w:t xml:space="preserve">Limitation / gap: </w:t>
       </w:r>
       <w:r>
         <w:rPr>
           <w:rFonts w:ascii="Times New Roman" w:hAnsi="Times New Roman"/>
-          <w:sz w:val="20"/>
+          <w:sz w:val="22"/>
         </w:rPr>
         <w:t xml:space="preserve">Language-specific (German) corpus focused on therapy modifications; evaluated on isolated clips without an integrated pipeline. </w:t>
       </w:r>
@@ -1783,21 +1783,21 @@
         <w:rPr>
           <w:rFonts w:ascii="Times New Roman" w:hAnsi="Times New Roman"/>
           <w:b/>
-          <w:sz w:val="20"/>
+          <w:sz w:val="22"/>
         </w:rPr>
         <w:t xml:space="preserve">Relevance to VoxFlow: </w:t>
       </w:r>
       <w:r>
         <w:rPr>
           <w:rFonts w:ascii="Times New Roman" w:hAnsi="Times New Roman"/>
-          <w:sz w:val="20"/>
+          <w:sz w:val="22"/>
         </w:rPr>
         <w:t xml:space="preserve">Underlines the clinical necessity of independently tracking repetition, prolongation, and block classes across assessment sessions. </w:t>
       </w:r>
     </w:p>
     <w:p>
       <w:pPr>
-        <w:spacing w:line="288" w:lineRule="auto" w:before="60" w:after="40"/>
+        <w:spacing w:line="360" w:lineRule="auto" w:before="80" w:after="40"/>
         <w:ind w:firstLine="0"/>
         <w:jc w:val="both"/>
       </w:pPr>
@@ -1805,7 +1805,7 @@
         <w:rPr>
           <w:rFonts w:ascii="Times New Roman" w:hAnsi="Times New Roman"/>
           <w:b/>
-          <w:sz w:val="22"/>
+          <w:sz w:val="24"/>
         </w:rPr>
         <w:t>3.1.9 Bayerl et al. (2022b) [9]</w:t>
         <w:br/>
@@ -1814,14 +1814,14 @@
         <w:rPr>
           <w:rFonts w:ascii="Times New Roman" w:hAnsi="Times New Roman"/>
           <w:b/>
-          <w:sz w:val="20"/>
+          <w:sz w:val="22"/>
         </w:rPr>
         <w:t xml:space="preserve">Problem: </w:t>
       </w:r>
       <w:r>
         <w:rPr>
           <w:rFonts w:ascii="Times New Roman" w:hAnsi="Times New Roman"/>
-          <w:sz w:val="20"/>
+          <w:sz w:val="22"/>
         </w:rPr>
         <w:t xml:space="preserve">Suboptimal classification performance of conventional handcrafted acoustic features (MFCCs, filterbanks) on subtle disfluency cues. </w:t>
       </w:r>
@@ -1829,14 +1829,14 @@
         <w:rPr>
           <w:rFonts w:ascii="Times New Roman" w:hAnsi="Times New Roman"/>
           <w:b/>
-          <w:sz w:val="20"/>
+          <w:sz w:val="22"/>
         </w:rPr>
         <w:t xml:space="preserve">Method: </w:t>
       </w:r>
       <w:r>
         <w:rPr>
           <w:rFonts w:ascii="Times New Roman" w:hAnsi="Times New Roman"/>
-          <w:sz w:val="20"/>
+          <w:sz w:val="22"/>
         </w:rPr>
         <w:t xml:space="preserve">Extracted deep acoustic representations from fine-tuned wav2vec 2.0 self-supervised models and evaluated them with SVM classifiers. </w:t>
       </w:r>
@@ -1844,14 +1844,14 @@
         <w:rPr>
           <w:rFonts w:ascii="Times New Roman" w:hAnsi="Times New Roman"/>
           <w:b/>
-          <w:sz w:val="20"/>
+          <w:sz w:val="22"/>
         </w:rPr>
         <w:t xml:space="preserve">Key finding: </w:t>
       </w:r>
       <w:r>
         <w:rPr>
           <w:rFonts w:ascii="Times New Roman" w:hAnsi="Times New Roman"/>
-          <w:sz w:val="20"/>
+          <w:sz w:val="22"/>
         </w:rPr>
         <w:t xml:space="preserve">Fine-tuned self-supervised speech representations achieved relative F1 score improvements of up to 27% over traditional baselines. </w:t>
       </w:r>
@@ -1859,14 +1859,14 @@
         <w:rPr>
           <w:rFonts w:ascii="Times New Roman" w:hAnsi="Times New Roman"/>
           <w:b/>
-          <w:sz w:val="20"/>
+          <w:sz w:val="22"/>
         </w:rPr>
         <w:t xml:space="preserve">Limitation / gap: </w:t>
       </w:r>
       <w:r>
         <w:rPr>
           <w:rFonts w:ascii="Times New Roman" w:hAnsi="Times New Roman"/>
-          <w:sz w:val="20"/>
+          <w:sz w:val="22"/>
         </w:rPr>
         <w:t xml:space="preserve">Relied on offline feature extraction and clip-level classifiers without session streaming or persistent database storage. </w:t>
       </w:r>
@@ -1874,21 +1874,21 @@
         <w:rPr>
           <w:rFonts w:ascii="Times New Roman" w:hAnsi="Times New Roman"/>
           <w:b/>
-          <w:sz w:val="20"/>
+          <w:sz w:val="22"/>
         </w:rPr>
         <w:t xml:space="preserve">Relevance to VoxFlow: </w:t>
       </w:r>
       <w:r>
         <w:rPr>
           <w:rFonts w:ascii="Times New Roman" w:hAnsi="Times New Roman"/>
-          <w:sz w:val="20"/>
+          <w:sz w:val="22"/>
         </w:rPr>
         <w:t xml:space="preserve">Provides foundational empirical justification for using pre-trained self-supervised transformer backbones in VoxFlow. </w:t>
       </w:r>
     </w:p>
     <w:p>
       <w:pPr>
-        <w:spacing w:line="288" w:lineRule="auto" w:before="60" w:after="40"/>
+        <w:spacing w:line="360" w:lineRule="auto" w:before="80" w:after="40"/>
         <w:ind w:firstLine="0"/>
         <w:jc w:val="both"/>
       </w:pPr>
@@ -1896,7 +1896,7 @@
         <w:rPr>
           <w:rFonts w:ascii="Times New Roman" w:hAnsi="Times New Roman"/>
           <w:b/>
-          <w:sz w:val="22"/>
+          <w:sz w:val="24"/>
         </w:rPr>
         <w:t>3.1.10 Bayerl et al. (2022c) [10]</w:t>
         <w:br/>
@@ -1905,14 +1905,14 @@
         <w:rPr>
           <w:rFonts w:ascii="Times New Roman" w:hAnsi="Times New Roman"/>
           <w:b/>
-          <w:sz w:val="20"/>
+          <w:sz w:val="22"/>
         </w:rPr>
         <w:t xml:space="preserve">Problem: </w:t>
       </w:r>
       <w:r>
         <w:rPr>
           <w:rFonts w:ascii="Times New Roman" w:hAnsi="Times New Roman"/>
-          <w:sz w:val="20"/>
+          <w:sz w:val="22"/>
         </w:rPr>
         <w:t xml:space="preserve">Overoptimistic performance claims in stuttering literature caused by speaker leakage across training and test splits. </w:t>
       </w:r>
@@ -1920,14 +1920,14 @@
         <w:rPr>
           <w:rFonts w:ascii="Times New Roman" w:hAnsi="Times New Roman"/>
           <w:b/>
-          <w:sz w:val="20"/>
+          <w:sz w:val="22"/>
         </w:rPr>
         <w:t xml:space="preserve">Method: </w:t>
       </w:r>
       <w:r>
         <w:rPr>
           <w:rFonts w:ascii="Times New Roman" w:hAnsi="Times New Roman"/>
-          <w:sz w:val="20"/>
+          <w:sz w:val="22"/>
         </w:rPr>
         <w:t xml:space="preserve">Extended SEP-28k with verified speaker identity labels (SEP-28k-Extended) and compared random clip splitting vs. speaker-exclusive partitioning. </w:t>
       </w:r>
@@ -1935,14 +1935,14 @@
         <w:rPr>
           <w:rFonts w:ascii="Times New Roman" w:hAnsi="Times New Roman"/>
           <w:b/>
-          <w:sz w:val="20"/>
+          <w:sz w:val="22"/>
         </w:rPr>
         <w:t xml:space="preserve">Key finding: </w:t>
       </w:r>
       <w:r>
         <w:rPr>
           <w:rFonts w:ascii="Times New Roman" w:hAnsi="Times New Roman"/>
-          <w:sz w:val="20"/>
+          <w:sz w:val="22"/>
         </w:rPr>
         <w:t xml:space="preserve">Proved random splitting severely overestimates detection accuracy; speaker-exclusive splits provide the only valid benchmark for real-world generalization. </w:t>
       </w:r>
@@ -1950,14 +1950,14 @@
         <w:rPr>
           <w:rFonts w:ascii="Times New Roman" w:hAnsi="Times New Roman"/>
           <w:b/>
-          <w:sz w:val="20"/>
+          <w:sz w:val="22"/>
         </w:rPr>
         <w:t xml:space="preserve">Limitation / gap: </w:t>
       </w:r>
       <w:r>
         <w:rPr>
           <w:rFonts w:ascii="Times New Roman" w:hAnsi="Times New Roman"/>
-          <w:sz w:val="20"/>
+          <w:sz w:val="22"/>
         </w:rPr>
         <w:t xml:space="preserve">Focused on dataset partitioning methodology without implementing capture hardware or session-level software pipelines. </w:t>
       </w:r>
@@ -1965,21 +1965,21 @@
         <w:rPr>
           <w:rFonts w:ascii="Times New Roman" w:hAnsi="Times New Roman"/>
           <w:b/>
-          <w:sz w:val="20"/>
+          <w:sz w:val="22"/>
         </w:rPr>
         <w:t xml:space="preserve">Relevance to VoxFlow: </w:t>
       </w:r>
       <w:r>
         <w:rPr>
           <w:rFonts w:ascii="Times New Roman" w:hAnsi="Times New Roman"/>
-          <w:sz w:val="20"/>
+          <w:sz w:val="22"/>
         </w:rPr>
         <w:t xml:space="preserve">VoxFlow directly adopts speaker-exclusive dataset partitioning (519 unique speakers, 0 overlap) to guarantee rigorous validation. </w:t>
       </w:r>
     </w:p>
     <w:p>
       <w:pPr>
-        <w:spacing w:line="288" w:lineRule="auto" w:before="60" w:after="40"/>
+        <w:spacing w:line="360" w:lineRule="auto" w:before="80" w:after="40"/>
         <w:ind w:firstLine="0"/>
         <w:jc w:val="both"/>
       </w:pPr>
@@ -1987,7 +1987,7 @@
         <w:rPr>
           <w:rFonts w:ascii="Times New Roman" w:hAnsi="Times New Roman"/>
           <w:b/>
-          <w:sz w:val="22"/>
+          <w:sz w:val="24"/>
         </w:rPr>
         <w:t>3.1.11 Bayerl et al. (2023) [11]</w:t>
         <w:br/>
@@ -1996,14 +1996,14 @@
         <w:rPr>
           <w:rFonts w:ascii="Times New Roman" w:hAnsi="Times New Roman"/>
           <w:b/>
-          <w:sz w:val="20"/>
+          <w:sz w:val="22"/>
         </w:rPr>
         <w:t xml:space="preserve">Problem: </w:t>
       </w:r>
       <w:r>
         <w:rPr>
           <w:rFonts w:ascii="Times New Roman" w:hAnsi="Times New Roman"/>
-          <w:sz w:val="20"/>
+          <w:sz w:val="22"/>
         </w:rPr>
         <w:t xml:space="preserve">Need for standardized comparative benchmarking of diverse acoustic, phonetic, and neural feature sets for stuttering classification. </w:t>
       </w:r>
@@ -2011,14 +2011,14 @@
         <w:rPr>
           <w:rFonts w:ascii="Times New Roman" w:hAnsi="Times New Roman"/>
           <w:b/>
-          <w:sz w:val="20"/>
+          <w:sz w:val="22"/>
         </w:rPr>
         <w:t xml:space="preserve">Method: </w:t>
       </w:r>
       <w:r>
         <w:rPr>
           <w:rFonts w:ascii="Times New Roman" w:hAnsi="Times New Roman"/>
-          <w:sz w:val="20"/>
+          <w:sz w:val="22"/>
         </w:rPr>
         <w:t xml:space="preserve">Analyzed results from the Interspeech ComParE 2022 Stuttering Sub-Challenge, benchmarking standard acoustic sets vs. deep embeddings. </w:t>
       </w:r>
@@ -2026,14 +2026,14 @@
         <w:rPr>
           <w:rFonts w:ascii="Times New Roman" w:hAnsi="Times New Roman"/>
           <w:b/>
-          <w:sz w:val="20"/>
+          <w:sz w:val="22"/>
         </w:rPr>
         <w:t xml:space="preserve">Key finding: </w:t>
       </w:r>
       <w:r>
         <w:rPr>
           <w:rFonts w:ascii="Times New Roman" w:hAnsi="Times New Roman"/>
-          <w:sz w:val="20"/>
+          <w:sz w:val="22"/>
         </w:rPr>
         <w:t xml:space="preserve">Pre-trained deep acoustic representations consistently and significantly outperformed handcrafted feature engineering. </w:t>
       </w:r>
@@ -2041,14 +2041,14 @@
         <w:rPr>
           <w:rFonts w:ascii="Times New Roman" w:hAnsi="Times New Roman"/>
           <w:b/>
-          <w:sz w:val="20"/>
+          <w:sz w:val="22"/>
         </w:rPr>
         <w:t xml:space="preserve">Limitation / gap: </w:t>
       </w:r>
       <w:r>
         <w:rPr>
           <w:rFonts w:ascii="Times New Roman" w:hAnsi="Times New Roman"/>
-          <w:sz w:val="20"/>
+          <w:sz w:val="22"/>
         </w:rPr>
         <w:t xml:space="preserve">Focused exclusively on comparative challenge metrics without addressing real-time capture, serial framing, or clinical session interfaces. </w:t>
       </w:r>
@@ -2056,21 +2056,21 @@
         <w:rPr>
           <w:rFonts w:ascii="Times New Roman" w:hAnsi="Times New Roman"/>
           <w:b/>
-          <w:sz w:val="20"/>
+          <w:sz w:val="22"/>
         </w:rPr>
         <w:t xml:space="preserve">Relevance to VoxFlow: </w:t>
       </w:r>
       <w:r>
         <w:rPr>
           <w:rFonts w:ascii="Times New Roman" w:hAnsi="Times New Roman"/>
-          <w:sz w:val="20"/>
+          <w:sz w:val="22"/>
         </w:rPr>
         <w:t xml:space="preserve">Supports VoxFlow's architectural choice of fine-tuned self-supervised transformers over baseline MFCC pipelines. </w:t>
       </w:r>
     </w:p>
     <w:p>
       <w:pPr>
-        <w:spacing w:line="288" w:lineRule="auto" w:before="60" w:after="40"/>
+        <w:spacing w:line="360" w:lineRule="auto" w:before="80" w:after="40"/>
         <w:ind w:firstLine="0"/>
         <w:jc w:val="both"/>
       </w:pPr>
@@ -2078,7 +2078,7 @@
         <w:rPr>
           <w:rFonts w:ascii="Times New Roman" w:hAnsi="Times New Roman"/>
           <w:b/>
-          <w:sz w:val="22"/>
+          <w:sz w:val="24"/>
         </w:rPr>
         <w:t>3.1.12 Baevski et al. (2020) [12]</w:t>
         <w:br/>
@@ -2087,14 +2087,14 @@
         <w:rPr>
           <w:rFonts w:ascii="Times New Roman" w:hAnsi="Times New Roman"/>
           <w:b/>
-          <w:sz w:val="20"/>
+          <w:sz w:val="22"/>
         </w:rPr>
         <w:t xml:space="preserve">Problem: </w:t>
       </w:r>
       <w:r>
         <w:rPr>
           <w:rFonts w:ascii="Times New Roman" w:hAnsi="Times New Roman"/>
-          <w:sz w:val="20"/>
+          <w:sz w:val="22"/>
         </w:rPr>
         <w:t xml:space="preserve">Training high-performing speech recognition models requires thousands of hours of scarce, expensive human-annotated speech. </w:t>
       </w:r>
@@ -2102,14 +2102,14 @@
         <w:rPr>
           <w:rFonts w:ascii="Times New Roman" w:hAnsi="Times New Roman"/>
           <w:b/>
-          <w:sz w:val="20"/>
+          <w:sz w:val="22"/>
         </w:rPr>
         <w:t xml:space="preserve">Method: </w:t>
       </w:r>
       <w:r>
         <w:rPr>
           <w:rFonts w:ascii="Times New Roman" w:hAnsi="Times New Roman"/>
-          <w:sz w:val="20"/>
+          <w:sz w:val="22"/>
         </w:rPr>
         <w:t xml:space="preserve">Introduced wav2vec 2.0, a self-supervised learning framework that masks latent speech representations and optimizes a contrastive task. </w:t>
       </w:r>
@@ -2117,14 +2117,14 @@
         <w:rPr>
           <w:rFonts w:ascii="Times New Roman" w:hAnsi="Times New Roman"/>
           <w:b/>
-          <w:sz w:val="20"/>
+          <w:sz w:val="22"/>
         </w:rPr>
         <w:t xml:space="preserve">Key finding: </w:t>
       </w:r>
       <w:r>
         <w:rPr>
           <w:rFonts w:ascii="Times New Roman" w:hAnsi="Times New Roman"/>
-          <w:sz w:val="20"/>
+          <w:sz w:val="22"/>
         </w:rPr>
         <w:t xml:space="preserve">Self-supervised pre-training on unannotated audio builds rich acoustic representations that transfer effectively to downstream speech tasks. </w:t>
       </w:r>
@@ -2132,14 +2132,14 @@
         <w:rPr>
           <w:rFonts w:ascii="Times New Roman" w:hAnsi="Times New Roman"/>
           <w:b/>
-          <w:sz w:val="20"/>
+          <w:sz w:val="22"/>
         </w:rPr>
         <w:t xml:space="preserve">Limitation / gap: </w:t>
       </w:r>
       <w:r>
         <w:rPr>
           <w:rFonts w:ascii="Times New Roman" w:hAnsi="Times New Roman"/>
-          <w:sz w:val="20"/>
+          <w:sz w:val="22"/>
         </w:rPr>
         <w:t xml:space="preserve">General speech foundation model; requires fine-tuning and task-specific architecture for multi-label disfluency classification. </w:t>
       </w:r>
@@ -2147,21 +2147,21 @@
         <w:rPr>
           <w:rFonts w:ascii="Times New Roman" w:hAnsi="Times New Roman"/>
           <w:b/>
-          <w:sz w:val="20"/>
+          <w:sz w:val="22"/>
         </w:rPr>
         <w:t xml:space="preserve">Relevance to VoxFlow: </w:t>
       </w:r>
       <w:r>
         <w:rPr>
           <w:rFonts w:ascii="Times New Roman" w:hAnsi="Times New Roman"/>
-          <w:sz w:val="20"/>
+          <w:sz w:val="22"/>
         </w:rPr>
         <w:t xml:space="preserve">wav2vec 2.0 serves as the primary comparative self-supervised baseline in VoxFlow's model benchmarking. </w:t>
       </w:r>
     </w:p>
     <w:p>
       <w:pPr>
-        <w:spacing w:line="288" w:lineRule="auto" w:before="60" w:after="40"/>
+        <w:spacing w:line="360" w:lineRule="auto" w:before="80" w:after="40"/>
         <w:ind w:firstLine="0"/>
         <w:jc w:val="both"/>
       </w:pPr>
@@ -2169,7 +2169,7 @@
         <w:rPr>
           <w:rFonts w:ascii="Times New Roman" w:hAnsi="Times New Roman"/>
           <w:b/>
-          <w:sz w:val="22"/>
+          <w:sz w:val="24"/>
         </w:rPr>
         <w:t>3.1.13 Hsu et al. (2021) [13]</w:t>
         <w:br/>
@@ -2178,14 +2178,14 @@
         <w:rPr>
           <w:rFonts w:ascii="Times New Roman" w:hAnsi="Times New Roman"/>
           <w:b/>
-          <w:sz w:val="20"/>
+          <w:sz w:val="22"/>
         </w:rPr>
         <w:t xml:space="preserve">Problem: </w:t>
       </w:r>
       <w:r>
         <w:rPr>
           <w:rFonts w:ascii="Times New Roman" w:hAnsi="Times New Roman"/>
-          <w:sz w:val="20"/>
+          <w:sz w:val="22"/>
         </w:rPr>
         <w:t xml:space="preserve">Contrastive speech models face optimization instability and risk conflating acoustic background noise with phonetic units. </w:t>
       </w:r>
@@ -2193,14 +2193,14 @@
         <w:rPr>
           <w:rFonts w:ascii="Times New Roman" w:hAnsi="Times New Roman"/>
           <w:b/>
-          <w:sz w:val="20"/>
+          <w:sz w:val="22"/>
         </w:rPr>
         <w:t xml:space="preserve">Method: </w:t>
       </w:r>
       <w:r>
         <w:rPr>
           <w:rFonts w:ascii="Times New Roman" w:hAnsi="Times New Roman"/>
-          <w:sz w:val="20"/>
+          <w:sz w:val="22"/>
         </w:rPr>
         <w:t xml:space="preserve">Proposed HuBERT (Hidden-Unit BERT), using offline k-means clustering to create discrete targets followed by masked language modeling on continuous audio. </w:t>
       </w:r>
@@ -2208,14 +2208,14 @@
         <w:rPr>
           <w:rFonts w:ascii="Times New Roman" w:hAnsi="Times New Roman"/>
           <w:b/>
-          <w:sz w:val="20"/>
+          <w:sz w:val="22"/>
         </w:rPr>
         <w:t xml:space="preserve">Key finding: </w:t>
       </w:r>
       <w:r>
         <w:rPr>
           <w:rFonts w:ascii="Times New Roman" w:hAnsi="Times New Roman"/>
-          <w:sz w:val="20"/>
+          <w:sz w:val="22"/>
         </w:rPr>
         <w:t xml:space="preserve">HuBERT achieves superior acoustic and phonetic representation stability and out-of-domain generalization compared to contrastive frameworks. </w:t>
       </w:r>
@@ -2223,14 +2223,14 @@
         <w:rPr>
           <w:rFonts w:ascii="Times New Roman" w:hAnsi="Times New Roman"/>
           <w:b/>
-          <w:sz w:val="20"/>
+          <w:sz w:val="22"/>
         </w:rPr>
         <w:t xml:space="preserve">Limitation / gap: </w:t>
       </w:r>
       <w:r>
         <w:rPr>
           <w:rFonts w:ascii="Times New Roman" w:hAnsi="Times New Roman"/>
-          <w:sz w:val="20"/>
+          <w:sz w:val="22"/>
         </w:rPr>
         <w:t xml:space="preserve">Foundation model trained on fluent read speech; requires multi-label fine-tuning and threshold calibration for disordered speech. </w:t>
       </w:r>
@@ -2238,14 +2238,14 @@
         <w:rPr>
           <w:rFonts w:ascii="Times New Roman" w:hAnsi="Times New Roman"/>
           <w:b/>
-          <w:sz w:val="20"/>
+          <w:sz w:val="22"/>
         </w:rPr>
         <w:t xml:space="preserve">Relevance to VoxFlow: </w:t>
       </w:r>
       <w:r>
         <w:rPr>
           <w:rFonts w:ascii="Times New Roman" w:hAnsi="Times New Roman"/>
-          <w:sz w:val="20"/>
+          <w:sz w:val="22"/>
         </w:rPr>
         <w:t xml:space="preserve">HuBERT serves as the foundational backbone for VoxFlow's fine-tuned HuBERT-D classifier (Macro F1 = 0.4599, ROC-AUC = 0.8099). </w:t>
       </w:r>
@@ -2267,8 +2267,8 @@
     </w:p>
     <w:p>
       <w:pPr>
-        <w:spacing w:line="300" w:lineRule="auto" w:after="40"/>
-        <w:ind w:firstLine="576"/>
+        <w:spacing w:line="360" w:lineRule="auto" w:after="40"/>
+        <w:ind w:firstLine="720"/>
         <w:jc w:val="both"/>
       </w:pPr>
       <w:r>
@@ -2281,8 +2281,8 @@
     </w:p>
     <w:p>
       <w:pPr>
-        <w:spacing w:line="300" w:lineRule="auto" w:after="40"/>
-        <w:ind w:firstLine="576"/>
+        <w:spacing w:line="360" w:lineRule="auto" w:after="40"/>
+        <w:ind w:firstLine="720"/>
         <w:jc w:val="both"/>
       </w:pPr>
       <w:r>
@@ -2290,7 +2290,7 @@
           <w:rFonts w:ascii="Times New Roman" w:hAnsi="Times New Roman"/>
           <w:sz w:val="24"/>
         </w:rPr>
-        <w:t>However, across all reviewed literature, existing systems operate almost exclusively on isolated, pre-trimmed 3-second audio clips. None of the reviewed approaches combine physical microphone capture, error-checked serial transport, sliding-window session inference, temporal event consolidation (to prevent multi-counting across overlapping windows), and relational session persistence in a single deployable software-hardware framework. VoxFlow directly bridges this gap.</w:t>
+        <w:t>However, across all reviewed literature, existing systems operate almost exclusively on isolated, pre-trimmed 3-second audio clips. In the set of studies reviewed, we did not find a system that combines physical microphone capture, error-checked serial transport, sliding-window session inference, temporal event consolidation (to prevent multi-counting across overlapping windows), and relational session persistence in a single deployable software-hardware framework. VoxFlow directly addresses this gap.</w:t>
       </w:r>
     </w:p>
     <w:p>
@@ -2310,8 +2310,8 @@
     </w:p>
     <w:p>
       <w:pPr>
-        <w:spacing w:line="300" w:lineRule="auto" w:after="40"/>
-        <w:ind w:firstLine="576"/>
+        <w:spacing w:line="360" w:lineRule="auto" w:after="40"/>
+        <w:ind w:firstLine="720"/>
         <w:jc w:val="both"/>
       </w:pPr>
       <w:r>
@@ -2324,8 +2324,8 @@
     </w:p>
     <w:p>
       <w:pPr>
-        <w:spacing w:line="300" w:lineRule="auto" w:after="20"/>
-        <w:ind w:left="504" w:hanging="288"/>
+        <w:spacing w:line="360" w:lineRule="auto" w:after="20"/>
+        <w:ind w:left="720" w:hanging="360"/>
         <w:jc w:val="both"/>
       </w:pPr>
       <w:r>
@@ -2354,8 +2354,8 @@
     </w:p>
     <w:p>
       <w:pPr>
-        <w:spacing w:line="300" w:lineRule="auto" w:after="20"/>
-        <w:ind w:left="504" w:hanging="288"/>
+        <w:spacing w:line="360" w:lineRule="auto" w:after="20"/>
+        <w:ind w:left="720" w:hanging="360"/>
         <w:jc w:val="both"/>
       </w:pPr>
       <w:r>
@@ -2384,8 +2384,8 @@
     </w:p>
     <w:p>
       <w:pPr>
-        <w:spacing w:line="300" w:lineRule="auto" w:after="20"/>
-        <w:ind w:left="504" w:hanging="288"/>
+        <w:spacing w:line="360" w:lineRule="auto" w:after="20"/>
+        <w:ind w:left="720" w:hanging="360"/>
         <w:jc w:val="both"/>
       </w:pPr>
       <w:r>
@@ -2409,13 +2409,13 @@
           <w:rFonts w:ascii="Times New Roman" w:hAnsi="Times New Roman"/>
           <w:sz w:val="24"/>
         </w:rPr>
-        <w:t>Clinicians require structured historical tracking across successive sessions to evaluate intervention efficacy, which existing clip-level benchmarks do not support.</w:t>
+        <w:t>Therapists require structured historical tracking across successive sessions to evaluate intervention efficacy, which existing clip-level benchmarks do not support.</w:t>
       </w:r>
     </w:p>
     <w:p>
       <w:pPr>
-        <w:spacing w:line="300" w:lineRule="auto" w:after="40"/>
-        <w:ind w:firstLine="576"/>
+        <w:spacing w:line="360" w:lineRule="auto" w:after="40"/>
+        <w:ind w:firstLine="720"/>
         <w:jc w:val="both"/>
       </w:pPr>
       <w:r>
@@ -2458,8 +2458,8 @@
     </w:p>
     <w:p>
       <w:pPr>
-        <w:spacing w:line="300" w:lineRule="auto" w:after="40"/>
-        <w:ind w:firstLine="576"/>
+        <w:spacing w:line="360" w:lineRule="auto" w:after="40"/>
+        <w:ind w:firstLine="720"/>
         <w:jc w:val="both"/>
       </w:pPr>
       <w:r>
@@ -2487,8 +2487,8 @@
     </w:p>
     <w:p>
       <w:pPr>
-        <w:spacing w:line="300" w:lineRule="auto" w:after="40"/>
-        <w:ind w:firstLine="576"/>
+        <w:spacing w:line="360" w:lineRule="auto" w:after="40"/>
+        <w:ind w:firstLine="720"/>
         <w:jc w:val="both"/>
       </w:pPr>
       <w:r>
@@ -2516,8 +2516,8 @@
     </w:p>
     <w:p>
       <w:pPr>
-        <w:spacing w:line="300" w:lineRule="auto" w:after="40"/>
-        <w:ind w:firstLine="576"/>
+        <w:spacing w:line="360" w:lineRule="auto" w:after="40"/>
+        <w:ind w:firstLine="720"/>
         <w:jc w:val="both"/>
       </w:pPr>
       <w:r>
@@ -2545,8 +2545,8 @@
     </w:p>
     <w:p>
       <w:pPr>
-        <w:spacing w:line="300" w:lineRule="auto" w:after="40"/>
-        <w:ind w:firstLine="576"/>
+        <w:spacing w:line="360" w:lineRule="auto" w:after="40"/>
+        <w:ind w:firstLine="720"/>
         <w:jc w:val="both"/>
       </w:pPr>
       <w:r>
@@ -2554,7 +2554,7 @@
           <w:rFonts w:ascii="Times New Roman" w:hAnsi="Times New Roman"/>
           <w:sz w:val="24"/>
         </w:rPr>
-        <w:t>Model development is based on the SEP-28k [2] and FluencyBank [3] datasets. To ensure clinical validity and eliminate label noise, the raw dataset was rigorously audited. Clips marked by annotators as poor audio quality, no speech, or music were filtered out. Multi-label ground truth was assigned using majority voting (at least 2 out of 3 annotators in agreement). To ensure uncompromised generalization, the resulting 30,999 clips were partitioned into strict speaker-exclusive splits across 519 distinct speakers, ensuring zero speaker overlap between training, validation, and testing sets, as summarized in Table 1.</w:t>
+        <w:t>Model development is based on the SEP-28k [2] and FluencyBank [3] datasets. To ensure validity and eliminate label noise, the raw dataset was rigorously audited. Clips marked by annotators as poor audio quality, no speech, or music were filtered out. Multi-label ground truth was assigned using majority voting (at least 2 out of 3 annotators in agreement). To ensure uncompromised generalization, the resulting 30,999 clips were partitioned into strict speaker-exclusive splits across 519 distinct speakers, ensuring zero speaker overlap between training, validation, and testing sets, as summarized in Table 1.</w:t>
       </w:r>
     </w:p>
     <w:p>
@@ -3527,8 +3527,8 @@
     </w:p>
     <w:p>
       <w:pPr>
-        <w:spacing w:line="300" w:lineRule="auto" w:after="40"/>
-        <w:ind w:firstLine="576"/>
+        <w:spacing w:line="360" w:lineRule="auto" w:after="40"/>
+        <w:ind w:firstLine="720"/>
         <w:jc w:val="both"/>
       </w:pPr>
       <w:r>
@@ -3556,8 +3556,8 @@
     </w:p>
     <w:p>
       <w:pPr>
-        <w:spacing w:line="300" w:lineRule="auto" w:after="40"/>
-        <w:ind w:firstLine="576"/>
+        <w:spacing w:line="360" w:lineRule="auto" w:after="40"/>
+        <w:ind w:firstLine="720"/>
         <w:jc w:val="both"/>
       </w:pPr>
       <w:r>
@@ -3585,8 +3585,8 @@
     </w:p>
     <w:p>
       <w:pPr>
-        <w:spacing w:line="300" w:lineRule="auto" w:after="40"/>
-        <w:ind w:firstLine="576"/>
+        <w:spacing w:line="360" w:lineRule="auto" w:after="40"/>
+        <w:ind w:firstLine="720"/>
         <w:jc w:val="both"/>
       </w:pPr>
       <w:r>
@@ -3599,8 +3599,8 @@
     </w:p>
     <w:p>
       <w:pPr>
-        <w:spacing w:line="300" w:lineRule="auto" w:after="20"/>
-        <w:ind w:left="504" w:hanging="288"/>
+        <w:spacing w:line="360" w:lineRule="auto" w:after="20"/>
+        <w:ind w:left="720" w:hanging="360"/>
         <w:jc w:val="both"/>
       </w:pPr>
       <w:r>
@@ -3629,8 +3629,8 @@
     </w:p>
     <w:p>
       <w:pPr>
-        <w:spacing w:line="300" w:lineRule="auto" w:after="20"/>
-        <w:ind w:left="504" w:hanging="288"/>
+        <w:spacing w:line="360" w:lineRule="auto" w:after="20"/>
+        <w:ind w:left="720" w:hanging="360"/>
         <w:jc w:val="both"/>
       </w:pPr>
       <w:r>
@@ -3659,8 +3659,8 @@
     </w:p>
     <w:p>
       <w:pPr>
-        <w:spacing w:line="300" w:lineRule="auto" w:after="20"/>
-        <w:ind w:left="504" w:hanging="288"/>
+        <w:spacing w:line="360" w:lineRule="auto" w:after="20"/>
+        <w:ind w:left="720" w:hanging="360"/>
         <w:jc w:val="both"/>
       </w:pPr>
       <w:r>
@@ -3689,8 +3689,8 @@
     </w:p>
     <w:p>
       <w:pPr>
-        <w:spacing w:line="300" w:lineRule="auto" w:after="20"/>
-        <w:ind w:left="504" w:hanging="288"/>
+        <w:spacing w:line="360" w:lineRule="auto" w:after="20"/>
+        <w:ind w:left="720" w:hanging="360"/>
         <w:jc w:val="both"/>
       </w:pPr>
       <w:r>
@@ -3707,7 +3707,7 @@
           <w:b/>
           <w:sz w:val="24"/>
         </w:rPr>
-        <w:t xml:space="preserve">Module 4 — Clinical Visual Analytics Dashboard: </w:t>
+        <w:t xml:space="preserve">Module 4 — Session Visual Analytics Dashboard: </w:t>
       </w:r>
       <w:r>
         <w:rPr>
@@ -3719,8 +3719,8 @@
     </w:p>
     <w:p>
       <w:pPr>
-        <w:spacing w:line="300" w:lineRule="auto" w:after="40"/>
-        <w:ind w:firstLine="576"/>
+        <w:spacing w:line="360" w:lineRule="auto" w:after="40"/>
+        <w:ind w:firstLine="720"/>
         <w:jc w:val="both"/>
       </w:pPr>
       <w:r>
@@ -3763,8 +3763,8 @@
     </w:p>
     <w:p>
       <w:pPr>
-        <w:spacing w:line="300" w:lineRule="auto" w:after="40"/>
-        <w:ind w:firstLine="576"/>
+        <w:spacing w:line="360" w:lineRule="auto" w:after="40"/>
+        <w:ind w:firstLine="720"/>
         <w:jc w:val="both"/>
       </w:pPr>
       <w:r>
@@ -4382,8 +4382,8 @@
     </w:p>
     <w:p>
       <w:pPr>
-        <w:spacing w:line="300" w:lineRule="auto" w:after="40"/>
-        <w:ind w:firstLine="576"/>
+        <w:spacing w:line="360" w:lineRule="auto" w:after="40"/>
+        <w:ind w:firstLine="720"/>
         <w:jc w:val="both"/>
       </w:pPr>
       <w:r>
@@ -5235,8 +5235,8 @@
     </w:p>
     <w:p>
       <w:pPr>
-        <w:spacing w:line="300" w:lineRule="auto" w:after="40"/>
-        <w:ind w:firstLine="576"/>
+        <w:spacing w:line="360" w:lineRule="auto" w:after="40"/>
+        <w:ind w:firstLine="720"/>
         <w:jc w:val="both"/>
       </w:pPr>
       <w:r>
@@ -5650,7 +5650,7 @@
                 <w:rFonts w:ascii="Times New Roman" w:hAnsi="Times New Roman"/>
                 <w:sz w:val="17"/>
               </w:rPr>
-              <w:t>The backend shall aggregate consecutive/proximate window detections (gap &lt;= 1.5 s) into unified clinical events.</w:t>
+              <w:t>The backend shall aggregate consecutive/proximate window detections (gap &lt;= 1.5 s) into unified detected events.</w:t>
             </w:r>
           </w:p>
         </w:tc>
@@ -5779,8 +5779,8 @@
     </w:p>
     <w:p>
       <w:pPr>
-        <w:spacing w:line="300" w:lineRule="auto" w:after="40"/>
-        <w:ind w:firstLine="576"/>
+        <w:spacing w:line="360" w:lineRule="auto" w:after="40"/>
+        <w:ind w:firstLine="720"/>
         <w:jc w:val="both"/>
       </w:pPr>
       <w:r>
@@ -5928,7 +5928,7 @@
                 <w:rFonts w:ascii="Times New Roman" w:hAnsi="Times New Roman"/>
                 <w:sz w:val="17"/>
               </w:rPr>
-              <w:t>End-to-end session analysis (validation, inference, aggregation, database write) shall complete in &lt; 5.0 s for a 60 s recording on GPU.</w:t>
+              <w:t>End-to-end session analysis (validation, inference, aggregation, database write) shall complete promptly on local hardware without cloud round-trip delays.</w:t>
             </w:r>
           </w:p>
         </w:tc>
@@ -6088,7 +6088,7 @@
                 <w:rFonts w:ascii="Times New Roman" w:hAnsi="Times New Roman"/>
                 <w:sz w:val="17"/>
               </w:rPr>
-              <w:t>All patient audio recordings, transcripts, and analysis metrics shall remain stored locally on the host machine.</w:t>
+              <w:t>All audio recordings, transcripts, and analysis metrics shall remain stored locally on the host machine.</w:t>
             </w:r>
           </w:p>
         </w:tc>
@@ -6232,8 +6232,8 @@
     </w:p>
     <w:p>
       <w:pPr>
-        <w:spacing w:line="300" w:lineRule="auto" w:after="40"/>
-        <w:ind w:firstLine="576"/>
+        <w:spacing w:line="360" w:lineRule="auto" w:after="40"/>
+        <w:ind w:firstLine="720"/>
         <w:jc w:val="both"/>
       </w:pPr>
       <w:r>
@@ -6319,8 +6319,8 @@
     </w:p>
     <w:p>
       <w:pPr>
-        <w:spacing w:line="300" w:lineRule="auto" w:after="40"/>
-        <w:ind w:firstLine="576"/>
+        <w:spacing w:line="360" w:lineRule="auto" w:after="40"/>
+        <w:ind w:firstLine="720"/>
         <w:jc w:val="both"/>
       </w:pPr>
       <w:r>
@@ -6333,8 +6333,8 @@
     </w:p>
     <w:p>
       <w:pPr>
-        <w:spacing w:line="300" w:lineRule="auto" w:after="40"/>
-        <w:ind w:firstLine="576"/>
+        <w:spacing w:line="360" w:lineRule="auto" w:after="40"/>
+        <w:ind w:firstLine="720"/>
         <w:jc w:val="both"/>
       </w:pPr>
       <w:r>
@@ -6405,7 +6405,7 @@
     </w:p>
     <w:p>
       <w:pPr>
-        <w:spacing w:line="300" w:lineRule="auto" w:after="40"/>
+        <w:spacing w:line="360" w:lineRule="auto" w:after="40"/>
         <w:ind w:firstLine="0"/>
         <w:jc w:val="both"/>
       </w:pPr>
@@ -6477,7 +6477,7 @@
     </w:p>
     <w:p>
       <w:pPr>
-        <w:spacing w:line="300" w:lineRule="auto" w:after="40"/>
+        <w:spacing w:line="360" w:lineRule="auto" w:after="40"/>
         <w:ind w:firstLine="0"/>
         <w:jc w:val="both"/>
       </w:pPr>
@@ -6549,7 +6549,7 @@
     </w:p>
     <w:p>
       <w:pPr>
-        <w:spacing w:line="300" w:lineRule="auto" w:after="40"/>
+        <w:spacing w:line="360" w:lineRule="auto" w:after="40"/>
         <w:ind w:firstLine="0"/>
         <w:jc w:val="both"/>
       </w:pPr>
@@ -6621,7 +6621,7 @@
     </w:p>
     <w:p>
       <w:pPr>
-        <w:spacing w:line="300" w:lineRule="auto" w:after="40"/>
+        <w:spacing w:line="360" w:lineRule="auto" w:after="40"/>
         <w:ind w:firstLine="0"/>
         <w:jc w:val="both"/>
       </w:pPr>
@@ -6693,7 +6693,7 @@
     </w:p>
     <w:p>
       <w:pPr>
-        <w:spacing w:line="300" w:lineRule="auto" w:after="40"/>
+        <w:spacing w:line="360" w:lineRule="auto" w:after="40"/>
         <w:ind w:firstLine="0"/>
         <w:jc w:val="both"/>
       </w:pPr>
@@ -6775,13 +6775,42 @@
           <w:b/>
           <w:sz w:val="28"/>
         </w:rPr>
-        <w:t>6.4 Deployment Design</w:t>
+        <w:t>6.3 Hardware and Firmware Design</w:t>
       </w:r>
     </w:p>
     <w:p>
       <w:pPr>
-        <w:spacing w:line="300" w:lineRule="auto" w:after="40"/>
-        <w:ind w:firstLine="576"/>
+        <w:spacing w:line="360" w:lineRule="auto" w:after="40"/>
+        <w:ind w:firstLine="720"/>
+        <w:jc w:val="both"/>
+      </w:pPr>
+      <w:r>
+        <w:rPr>
+          <w:rFonts w:ascii="Times New Roman" w:hAnsi="Times New Roman"/>
+          <w:sz w:val="24"/>
+        </w:rPr>
+        <w:t>The firmware is implemented in C++ using the ESP32 Arduino Core under FreeRTOS. To prevent audio buffer underruns, a dedicated producer task (I2SCaptureTask) pinned to Core 0 reads 1,024-sample chunks from the I2S DMA buffer and pushes them into a FreeRTOS ring queue. The main consumer loop running on Core 1 pops audio frames from the queue, constructs the 16-byte VXF1 header, calculates CRC32 checksums, and transmits framed packets over USB-UART.</w:t>
+      </w:r>
+    </w:p>
+    <w:p>
+      <w:pPr>
+        <w:keepNext/>
+        <w:spacing w:before="120" w:after="40" w:line="288" w:lineRule="auto"/>
+        <w:ind w:firstLine="0"/>
+      </w:pPr>
+      <w:r>
+        <w:rPr>
+          <w:rFonts w:ascii="Times New Roman" w:hAnsi="Times New Roman"/>
+          <w:b/>
+          <w:sz w:val="28"/>
+        </w:rPr>
+        <w:t>6.4 Deployment Design</w:t>
+      </w:r>
+    </w:p>
+    <w:p>
+      <w:pPr>
+        <w:spacing w:line="360" w:lineRule="auto" w:after="40"/>
+        <w:ind w:firstLine="720"/>
         <w:jc w:val="both"/>
       </w:pPr>
       <w:r>
@@ -6867,8 +6896,8 @@
     </w:p>
     <w:p>
       <w:pPr>
-        <w:spacing w:line="300" w:lineRule="auto" w:after="40"/>
-        <w:ind w:firstLine="576"/>
+        <w:spacing w:line="360" w:lineRule="auto" w:after="40"/>
+        <w:ind w:firstLine="720"/>
         <w:jc w:val="both"/>
       </w:pPr>
       <w:r>
@@ -6876,7 +6905,7 @@
           <w:rFonts w:ascii="Times New Roman" w:hAnsi="Times New Roman"/>
           <w:sz w:val="24"/>
         </w:rPr>
-        <w:t>The Entity-Relationship (ER) Diagram (Fig. 9) illustrates the relational database schema in app/voxflow.db. The schema consists of three normalized tables: (1) sessions, storing session-level metadata, duration, and summary event counts; (2) window_predictions, storing per-window timestamps and probability scores for repetition, prolongation, and block; and (3) aggregated_events, storing consolidated clinical events with start/end bounds, duration, and peak confidence.</w:t>
+        <w:t>The Entity-Relationship (ER) Diagram (Fig. 9) illustrates the relational database schema in app/voxflow.db. The schema consists of three normalized tables: (1) sessions, storing session-level metadata, duration, and summary event counts; (2) window_predictions, storing per-window timestamps and probability scores for repetition, prolongation, and block; and (3) aggregated_events, storing consolidated detected events with start/end bounds, duration, and peak confidence.</w:t>
       </w:r>
     </w:p>
     <w:p>
@@ -6969,8 +6998,8 @@
     </w:p>
     <w:p>
       <w:pPr>
-        <w:spacing w:line="300" w:lineRule="auto" w:after="40"/>
-        <w:ind w:firstLine="576"/>
+        <w:spacing w:line="360" w:lineRule="auto" w:after="40"/>
+        <w:ind w:firstLine="720"/>
         <w:jc w:val="both"/>
       </w:pPr>
       <w:r>
@@ -6978,7 +7007,7 @@
           <w:rFonts w:ascii="Times New Roman" w:hAnsi="Times New Roman"/>
           <w:sz w:val="24"/>
         </w:rPr>
-        <w:t>The VoxFlow methodology establishes a complete 12-step processing pipeline from physical acoustic capture to visual clinical analytics: (1) physical acoustic digitization, (2) I2S DMA buffering, (3) VXF1 framing, (4) serial transmission, (5) frame reception and CRC verification, (6) WAV file reconstruction, (7) audio validation, (8) sliding-window segmentation, (9) HuBERT-D neural inference, (10) temporal event aggregation, (11) relational database persistence, and (12) visual dashboard analytics.</w:t>
+        <w:t>The VoxFlow methodology establishes a complete 12-step processing pipeline from physical acoustic capture to visual session analytics: (1) physical acoustic digitization, (2) I2S DMA buffering, (3) VXF1 framing, (4) serial transmission, (5) frame reception and CRC verification, (6) WAV file reconstruction, (7) audio validation, (8) sliding-window segmentation, (9) HuBERT-D neural inference, (10) temporal event aggregation, (11) relational database persistence, and (12) visual dashboard analytics.</w:t>
       </w:r>
     </w:p>
     <w:p>
@@ -6998,8 +7027,8 @@
     </w:p>
     <w:p>
       <w:pPr>
-        <w:spacing w:line="300" w:lineRule="auto" w:after="40"/>
-        <w:ind w:firstLine="576"/>
+        <w:spacing w:line="360" w:lineRule="auto" w:after="40"/>
+        <w:ind w:firstLine="720"/>
         <w:jc w:val="both"/>
       </w:pPr>
       <w:r>
@@ -7905,8 +7934,8 @@
     </w:p>
     <w:p>
       <w:pPr>
-        <w:spacing w:line="300" w:lineRule="auto" w:after="40"/>
-        <w:ind w:firstLine="576"/>
+        <w:spacing w:line="360" w:lineRule="auto" w:after="40"/>
+        <w:ind w:firstLine="720"/>
         <w:jc w:val="both"/>
       </w:pPr>
       <w:r>
@@ -7934,8 +7963,8 @@
     </w:p>
     <w:p>
       <w:pPr>
-        <w:spacing w:line="300" w:lineRule="auto" w:after="40"/>
-        <w:ind w:firstLine="576"/>
+        <w:spacing w:line="360" w:lineRule="auto" w:after="40"/>
+        <w:ind w:firstLine="720"/>
         <w:jc w:val="both"/>
       </w:pPr>
       <w:r>
@@ -7963,8 +7992,8 @@
     </w:p>
     <w:p>
       <w:pPr>
-        <w:spacing w:line="300" w:lineRule="auto" w:after="40"/>
-        <w:ind w:firstLine="576"/>
+        <w:spacing w:line="360" w:lineRule="auto" w:after="40"/>
+        <w:ind w:firstLine="720"/>
         <w:jc w:val="both"/>
       </w:pPr>
       <w:r>
@@ -8050,8 +8079,8 @@
     </w:p>
     <w:p>
       <w:pPr>
-        <w:spacing w:line="300" w:lineRule="auto" w:after="40"/>
-        <w:ind w:firstLine="576"/>
+        <w:spacing w:line="360" w:lineRule="auto" w:after="40"/>
+        <w:ind w:firstLine="720"/>
         <w:jc w:val="both"/>
       </w:pPr>
       <w:r>
@@ -8059,7 +8088,7 @@
           <w:rFonts w:ascii="Times New Roman" w:hAnsi="Times New Roman"/>
           <w:sz w:val="24"/>
         </w:rPr>
-        <w:t>Because sliding windows overlap by 2.0 seconds, a single disfluent event spanning across adjacent windows produces multiple positive window detections. VoxFlow applies a temporal event aggregation algorithm (app/services/event_aggregator.py): for each disfluency class, positive windows that overlap or lie within a merge gap threshold (gap &lt;= 1.5 seconds) are merged into a single clinical event. The event start time is set to the first window's start, the end time to the last window's end, and the event confidence to the maximum probability observed across supporting windows.</w:t>
+        <w:t>Because sliding windows overlap by 2.0 seconds, a single disfluent event spanning across adjacent windows produces multiple positive window detections. VoxFlow applies a temporal event aggregation algorithm (app/services/event_aggregator.py): for each disfluency class, positive windows that overlap or lie within a merge gap threshold (gap &lt;= 1.5 seconds) are merged into a single detected disfluency event. The event start time is set to the first window's start, the end time to the last window's end, and the event confidence to the maximum probability observed across supporting windows.</w:t>
       </w:r>
     </w:p>
     <w:p>
@@ -8079,8 +8108,8 @@
     </w:p>
     <w:p>
       <w:pPr>
-        <w:spacing w:line="300" w:lineRule="auto" w:after="40"/>
-        <w:ind w:firstLine="576"/>
+        <w:spacing w:line="360" w:lineRule="auto" w:after="40"/>
+        <w:ind w:firstLine="720"/>
         <w:jc w:val="both"/>
       </w:pPr>
       <w:r>
@@ -8088,7 +8117,7 @@
           <w:rFonts w:ascii="Times New Roman" w:hAnsi="Times New Roman"/>
           <w:sz w:val="24"/>
         </w:rPr>
-        <w:t>Following event aggregation, the backend computes session-level summary statistics: total recording duration, effective speech duration, total disfluency count, disfluency rate (events per minute of speech), and per-class event breakdowns. These summary metrics provide speech therapists with immediate, standardized clinical indices.</w:t>
+        <w:t>Following event aggregation, the backend computes session-level summary statistics: total recording duration, effective speech duration, total disfluency count, disfluency rate (events per minute of speech), and per-class event breakdowns. These summary metrics provide immediate, standardized session indices.</w:t>
       </w:r>
     </w:p>
     <w:p>
@@ -8108,8 +8137,8 @@
     </w:p>
     <w:p>
       <w:pPr>
-        <w:spacing w:line="300" w:lineRule="auto" w:after="40"/>
-        <w:ind w:firstLine="576"/>
+        <w:spacing w:line="360" w:lineRule="auto" w:after="40"/>
+        <w:ind w:firstLine="720"/>
         <w:jc w:val="both"/>
       </w:pPr>
       <w:r>
@@ -8195,8 +8224,8 @@
     </w:p>
     <w:p>
       <w:pPr>
-        <w:spacing w:line="300" w:lineRule="auto" w:after="40"/>
-        <w:ind w:firstLine="576"/>
+        <w:spacing w:line="360" w:lineRule="auto" w:after="40"/>
+        <w:ind w:firstLine="720"/>
         <w:jc w:val="both"/>
       </w:pPr>
       <w:r>
@@ -8878,8 +8907,8 @@
     </w:p>
     <w:p>
       <w:pPr>
-        <w:spacing w:line="300" w:lineRule="auto" w:after="40"/>
-        <w:ind w:firstLine="576"/>
+        <w:spacing w:line="360" w:lineRule="auto" w:after="40"/>
+        <w:ind w:firstLine="720"/>
         <w:jc w:val="both"/>
       </w:pPr>
       <w:r>
@@ -8907,8 +8936,8 @@
     </w:p>
     <w:p>
       <w:pPr>
-        <w:spacing w:line="300" w:lineRule="auto" w:after="40"/>
-        <w:ind w:firstLine="576"/>
+        <w:spacing w:line="360" w:lineRule="auto" w:after="40"/>
+        <w:ind w:firstLine="720"/>
         <w:jc w:val="both"/>
       </w:pPr>
       <w:r>
@@ -8929,7 +8958,7 @@
       <w:r>
         <w:drawing>
           <wp:inline xmlns:a="http://schemas.openxmlformats.org/drawingml/2006/main" xmlns:pic="http://schemas.openxmlformats.org/drawingml/2006/picture">
-            <wp:extent cx="3291840" cy="2194560"/>
+            <wp:extent cx="4389120" cy="2926080"/>
             <wp:docPr id="13" name="Picture 13"/>
             <wp:cNvGraphicFramePr>
               <a:graphicFrameLocks noChangeAspect="1"/>
@@ -8950,7 +8979,7 @@
                   <pic:spPr>
                     <a:xfrm>
                       <a:off x="0" y="0"/>
-                      <a:ext cx="3291840" cy="2194560"/>
+                      <a:ext cx="4389120" cy="2926080"/>
                     </a:xfrm>
                     <a:prstGeom prst="rect"/>
                   </pic:spPr>
@@ -10332,8 +10361,8 @@
     </w:p>
     <w:p>
       <w:pPr>
-        <w:spacing w:line="300" w:lineRule="auto" w:after="40"/>
-        <w:ind w:firstLine="576"/>
+        <w:spacing w:line="360" w:lineRule="auto" w:after="40"/>
+        <w:ind w:firstLine="720"/>
         <w:jc w:val="both"/>
       </w:pPr>
       <w:r>
@@ -10346,8 +10375,8 @@
     </w:p>
     <w:p>
       <w:pPr>
-        <w:spacing w:line="300" w:lineRule="auto" w:after="20"/>
-        <w:ind w:left="504" w:hanging="288"/>
+        <w:spacing w:line="360" w:lineRule="auto" w:after="20"/>
+        <w:ind w:left="720" w:hanging="360"/>
         <w:jc w:val="both"/>
       </w:pPr>
       <w:r>
@@ -10376,8 +10405,8 @@
     </w:p>
     <w:p>
       <w:pPr>
-        <w:spacing w:line="300" w:lineRule="auto" w:after="20"/>
-        <w:ind w:left="504" w:hanging="288"/>
+        <w:spacing w:line="360" w:lineRule="auto" w:after="20"/>
+        <w:ind w:left="720" w:hanging="360"/>
         <w:jc w:val="both"/>
       </w:pPr>
       <w:r>
@@ -10406,8 +10435,8 @@
     </w:p>
     <w:p>
       <w:pPr>
-        <w:spacing w:line="300" w:lineRule="auto" w:after="20"/>
-        <w:ind w:left="504" w:hanging="288"/>
+        <w:spacing w:line="360" w:lineRule="auto" w:after="20"/>
+        <w:ind w:left="720" w:hanging="360"/>
         <w:jc w:val="both"/>
       </w:pPr>
       <w:r>
@@ -10436,8 +10465,8 @@
     </w:p>
     <w:p>
       <w:pPr>
-        <w:spacing w:line="300" w:lineRule="auto" w:after="20"/>
-        <w:ind w:left="504" w:hanging="288"/>
+        <w:spacing w:line="360" w:lineRule="auto" w:after="20"/>
+        <w:ind w:left="720" w:hanging="360"/>
         <w:jc w:val="both"/>
       </w:pPr>
       <w:r>
@@ -10496,8 +10525,8 @@
     </w:p>
     <w:p>
       <w:pPr>
-        <w:spacing w:line="300" w:lineRule="auto" w:after="40"/>
-        <w:ind w:firstLine="576"/>
+        <w:spacing w:line="360" w:lineRule="auto" w:after="40"/>
+        <w:ind w:firstLine="720"/>
         <w:jc w:val="both"/>
       </w:pPr>
       <w:r>
@@ -10525,8 +10554,8 @@
     </w:p>
     <w:p>
       <w:pPr>
-        <w:spacing w:line="300" w:lineRule="auto" w:after="40"/>
-        <w:ind w:firstLine="576"/>
+        <w:spacing w:line="360" w:lineRule="auto" w:after="40"/>
+        <w:ind w:firstLine="720"/>
         <w:jc w:val="both"/>
       </w:pPr>
       <w:r>
@@ -10554,8 +10583,8 @@
     </w:p>
     <w:p>
       <w:pPr>
-        <w:spacing w:line="300" w:lineRule="auto" w:after="40"/>
-        <w:ind w:firstLine="576"/>
+        <w:spacing w:line="360" w:lineRule="auto" w:after="40"/>
+        <w:ind w:firstLine="720"/>
         <w:jc w:val="both"/>
       </w:pPr>
       <w:r>
@@ -10583,8 +10612,8 @@
     </w:p>
     <w:p>
       <w:pPr>
-        <w:spacing w:line="300" w:lineRule="auto" w:after="40"/>
-        <w:ind w:firstLine="576"/>
+        <w:spacing w:line="360" w:lineRule="auto" w:after="40"/>
+        <w:ind w:firstLine="720"/>
         <w:jc w:val="both"/>
       </w:pPr>
       <w:r>
@@ -10612,8 +10641,8 @@
     </w:p>
     <w:p>
       <w:pPr>
-        <w:spacing w:line="300" w:lineRule="auto" w:after="40"/>
-        <w:ind w:firstLine="576"/>
+        <w:spacing w:line="360" w:lineRule="auto" w:after="40"/>
+        <w:ind w:firstLine="720"/>
         <w:jc w:val="both"/>
       </w:pPr>
       <w:r>
@@ -10621,7 +10650,7 @@
           <w:rFonts w:ascii="Times New Roman" w:hAnsi="Times New Roman"/>
           <w:sz w:val="24"/>
         </w:rPr>
-        <w:t>The event aggregator (app/services/event_aggregator.py) implements the temporal clustering algorithm described in Algorithm 3. It groups contiguous positive window activations within a 1.5-second merge threshold into single, consolidated clinical events, eliminating duplicate counts across overlapping analysis windows.</w:t>
+        <w:t>The event aggregator (app/services/event_aggregator.py) implements the temporal clustering algorithm described in Algorithm 3. It groups contiguous positive window activations within a 1.5-second merge threshold into single, consolidated detected events, eliminating duplicate counts across overlapping analysis windows.</w:t>
       </w:r>
     </w:p>
     <w:p>
@@ -10641,8 +10670,8 @@
     </w:p>
     <w:p>
       <w:pPr>
-        <w:spacing w:line="300" w:lineRule="auto" w:after="40"/>
-        <w:ind w:firstLine="576"/>
+        <w:spacing w:line="360" w:lineRule="auto" w:after="40"/>
+        <w:ind w:firstLine="720"/>
         <w:jc w:val="both"/>
       </w:pPr>
       <w:r>
@@ -10655,8 +10684,8 @@
     </w:p>
     <w:p>
       <w:pPr>
-        <w:spacing w:line="300" w:lineRule="auto" w:after="20"/>
-        <w:ind w:left="504" w:hanging="288"/>
+        <w:spacing w:line="360" w:lineRule="auto" w:after="20"/>
+        <w:ind w:left="720" w:hanging="360"/>
         <w:jc w:val="both"/>
       </w:pPr>
       <w:r>
@@ -10685,8 +10714,8 @@
     </w:p>
     <w:p>
       <w:pPr>
-        <w:spacing w:line="300" w:lineRule="auto" w:after="20"/>
-        <w:ind w:left="504" w:hanging="288"/>
+        <w:spacing w:line="360" w:lineRule="auto" w:after="20"/>
+        <w:ind w:left="720" w:hanging="360"/>
         <w:jc w:val="both"/>
       </w:pPr>
       <w:r>
@@ -10715,8 +10744,8 @@
     </w:p>
     <w:p>
       <w:pPr>
-        <w:spacing w:line="300" w:lineRule="auto" w:after="20"/>
-        <w:ind w:left="504" w:hanging="288"/>
+        <w:spacing w:line="360" w:lineRule="auto" w:after="20"/>
+        <w:ind w:left="720" w:hanging="360"/>
         <w:jc w:val="both"/>
       </w:pPr>
       <w:r>
@@ -10733,20 +10762,20 @@
           <w:b/>
           <w:sz w:val="24"/>
         </w:rPr>
-        <w:t xml:space="preserve">POST /api/v1/session/start &amp; stop: </w:t>
+        <w:t xml:space="preserve">POST /api/v1/session/start: </w:t>
       </w:r>
       <w:r>
         <w:rPr>
           <w:rFonts w:ascii="Times New Roman" w:hAnsi="Times New Roman"/>
           <w:sz w:val="24"/>
         </w:rPr>
-        <w:t>Controls hardware recording lifecycle via the serial bridge.</w:t>
+        <w:t>Initializes a new recording session and returns session ID.</w:t>
       </w:r>
     </w:p>
     <w:p>
       <w:pPr>
-        <w:spacing w:line="300" w:lineRule="auto" w:after="20"/>
-        <w:ind w:left="504" w:hanging="288"/>
+        <w:spacing w:line="360" w:lineRule="auto" w:after="20"/>
+        <w:ind w:left="720" w:hanging="360"/>
         <w:jc w:val="both"/>
       </w:pPr>
       <w:r>
@@ -10763,20 +10792,20 @@
           <w:b/>
           <w:sz w:val="24"/>
         </w:rPr>
-        <w:t xml:space="preserve">POST /api/v1/session/analyze: </w:t>
+        <w:t xml:space="preserve">POST /api/v1/session/&lt;session_id&gt;/audio: </w:t>
       </w:r>
       <w:r>
         <w:rPr>
           <w:rFonts w:ascii="Times New Roman" w:hAnsi="Times New Roman"/>
           <w:sz w:val="24"/>
         </w:rPr>
-        <w:t>Accepts a WAV audio file or session ID, performs end-to-end analysis, and returns complete session metrics and events.</w:t>
+        <w:t>Uploads raw audio stream chunks for active session buffering.</w:t>
       </w:r>
     </w:p>
     <w:p>
       <w:pPr>
-        <w:spacing w:line="300" w:lineRule="auto" w:after="20"/>
-        <w:ind w:left="504" w:hanging="288"/>
+        <w:spacing w:line="360" w:lineRule="auto" w:after="20"/>
+        <w:ind w:left="720" w:hanging="360"/>
         <w:jc w:val="both"/>
       </w:pPr>
       <w:r>
@@ -10793,14 +10822,104 @@
           <w:b/>
           <w:sz w:val="24"/>
         </w:rPr>
-        <w:t xml:space="preserve">GET /api/v1/sessions &amp; /api/v1/session/&lt;id&gt;: </w:t>
+        <w:t xml:space="preserve">POST /api/v1/session/&lt;session_id&gt;/stop: </w:t>
       </w:r>
       <w:r>
         <w:rPr>
           <w:rFonts w:ascii="Times New Roman" w:hAnsi="Times New Roman"/>
           <w:sz w:val="24"/>
         </w:rPr>
-        <w:t>Retrieves stored session records, event breakdowns, and historical data.</w:t>
+        <w:t>Terminates the recording session and persists session audio.</w:t>
+      </w:r>
+    </w:p>
+    <w:p>
+      <w:pPr>
+        <w:spacing w:line="360" w:lineRule="auto" w:after="20"/>
+        <w:ind w:left="720" w:hanging="360"/>
+        <w:jc w:val="both"/>
+      </w:pPr>
+      <w:r>
+        <w:rPr>
+          <w:rFonts w:ascii="Times New Roman" w:hAnsi="Times New Roman"/>
+          <w:b/>
+          <w:sz w:val="24"/>
+        </w:rPr>
+        <w:t xml:space="preserve">• </w:t>
+      </w:r>
+      <w:r>
+        <w:rPr>
+          <w:rFonts w:ascii="Times New Roman" w:hAnsi="Times New Roman"/>
+          <w:b/>
+          <w:sz w:val="24"/>
+        </w:rPr>
+        <w:t xml:space="preserve">POST /api/v1/session/&lt;session_id&gt;/analyze: </w:t>
+      </w:r>
+      <w:r>
+        <w:rPr>
+          <w:rFonts w:ascii="Times New Roman" w:hAnsi="Times New Roman"/>
+          <w:sz w:val="24"/>
+        </w:rPr>
+        <w:t>Validates session audio, generates sliding windows, executes HuBERT-D inference, aggregates detected events, and persists records.</w:t>
+      </w:r>
+    </w:p>
+    <w:p>
+      <w:pPr>
+        <w:spacing w:line="360" w:lineRule="auto" w:after="20"/>
+        <w:ind w:left="720" w:hanging="360"/>
+        <w:jc w:val="both"/>
+      </w:pPr>
+      <w:r>
+        <w:rPr>
+          <w:rFonts w:ascii="Times New Roman" w:hAnsi="Times New Roman"/>
+          <w:b/>
+          <w:sz w:val="24"/>
+        </w:rPr>
+        <w:t xml:space="preserve">• </w:t>
+      </w:r>
+      <w:r>
+        <w:rPr>
+          <w:rFonts w:ascii="Times New Roman" w:hAnsi="Times New Roman"/>
+          <w:b/>
+          <w:sz w:val="24"/>
+        </w:rPr>
+        <w:t xml:space="preserve">GET /api/v1/session/&lt;session_id&gt;: </w:t>
+      </w:r>
+      <w:r>
+        <w:rPr>
+          <w:rFonts w:ascii="Times New Roman" w:hAnsi="Times New Roman"/>
+          <w:sz w:val="24"/>
+        </w:rPr>
+        <w:t>Retrieves session metadata, window probabilities, and detected events.</w:t>
+      </w:r>
+    </w:p>
+    <w:p>
+      <w:pPr>
+        <w:spacing w:line="360" w:lineRule="auto" w:after="20"/>
+        <w:ind w:left="720" w:hanging="360"/>
+        <w:jc w:val="both"/>
+      </w:pPr>
+      <w:r>
+        <w:rPr>
+          <w:rFonts w:ascii="Times New Roman" w:hAnsi="Times New Roman"/>
+          <w:b/>
+          <w:sz w:val="24"/>
+        </w:rPr>
+        <w:t xml:space="preserve">• </w:t>
+      </w:r>
+      <w:r>
+        <w:rPr>
+          <w:rFonts w:ascii="Times New Roman" w:hAnsi="Times New Roman"/>
+          <w:b/>
+          <w:sz w:val="24"/>
+        </w:rPr>
+        <w:t xml:space="preserve">GET /api/v1/sessions: </w:t>
+      </w:r>
+      <w:r>
+        <w:rPr>
+          <w:rFonts w:ascii="Times New Roman" w:hAnsi="Times New Roman"/>
+          <w:sz w:val="24"/>
+        </w:rPr>
+        <w:t>Retrieves stored session history for longitudinal trend analytics.</w:t>
       </w:r>
     </w:p>
     <w:p>
@@ -10820,8 +10939,8 @@
     </w:p>
     <w:p>
       <w:pPr>
-        <w:spacing w:line="300" w:lineRule="auto" w:after="40"/>
-        <w:ind w:firstLine="576"/>
+        <w:spacing w:line="360" w:lineRule="auto" w:after="40"/>
+        <w:ind w:firstLine="720"/>
         <w:jc w:val="both"/>
       </w:pPr>
       <w:r>
@@ -10829,7 +10948,7 @@
           <w:rFonts w:ascii="Times New Roman" w:hAnsi="Times New Roman"/>
           <w:sz w:val="24"/>
         </w:rPr>
-        <w:t>The frontend dashboard (dashboard.py, app/ui/streamlit_app.py) provides a modern clinical visual analytics interface with four functional pages: (1) Live Hardware Capture, (2) Audio File Analysis, (3) Session Inspection &amp; Timeline, and (4) Longitudinal History &amp; Trends.</w:t>
+        <w:t>The frontend dashboard (dashboard.py, app/ui/streamlit_app.py) provides an interactive visual analytics interface with four functional pages: (1) Live Hardware Capture, (2) Audio File Analysis, (3) Session Inspection &amp; Timeline, and (4) Longitudinal History &amp; Trends.</w:t>
       </w:r>
     </w:p>
     <w:p>
@@ -10849,8 +10968,8 @@
     </w:p>
     <w:p>
       <w:pPr>
-        <w:spacing w:line="300" w:lineRule="auto" w:after="40"/>
-        <w:ind w:firstLine="576"/>
+        <w:spacing w:line="360" w:lineRule="auto" w:after="40"/>
+        <w:ind w:firstLine="720"/>
         <w:jc w:val="both"/>
       </w:pPr>
       <w:r>
@@ -10858,7 +10977,7 @@
           <w:rFonts w:ascii="Times New Roman" w:hAnsi="Times New Roman"/>
           <w:sz w:val="24"/>
         </w:rPr>
-        <w:t>VoxFlow represents an advanced integration of modern computer science disciplines: digital signal processing (I2S DMA sampling, audio normalization, sliding-window framing), self-supervised deep learning (Transformer-based acoustic representation learning and multi-label inference), algorithmic event processing (temporal clustering and merge-gap aggregation), relational database engineering (normalized SQLite schema with referential integrity), RESTful web architecture (decoupled HTTP microservices), and visual analytics (interactive time-series charting and longitudinal trend tracking). The current prototype does not use a cloud service at runtime. It runs locally on the PC, ensuring patient privacy, low latency, and zero cloud hosting costs.</w:t>
+        <w:t>VoxFlow represents an advanced integration of modern computer science disciplines: digital signal processing (I2S DMA sampling, audio normalization, sliding-window framing), self-supervised deep learning (Transformer-based acoustic representation learning and multi-label inference), algorithmic event processing (temporal clustering and merge-gap aggregation), relational database engineering (normalized SQLite schema with referential integrity), RESTful web architecture (decoupled HTTP microservices), and visual analytics (interactive time-series charting and longitudinal trend tracking). The current prototype does not use a cloud service at runtime. It runs locally on the host PC, ensuring that all audio recordings and analysis results remain stored on the local system without cloud hosting costs.</w:t>
       </w:r>
     </w:p>
     <w:p>
@@ -10893,8 +11012,8 @@
     </w:p>
     <w:p>
       <w:pPr>
-        <w:spacing w:line="300" w:lineRule="auto" w:after="40"/>
-        <w:ind w:firstLine="576"/>
+        <w:spacing w:line="360" w:lineRule="auto" w:after="40"/>
+        <w:ind w:firstLine="720"/>
         <w:jc w:val="both"/>
       </w:pPr>
       <w:r>
@@ -11693,8 +11812,8 @@
     </w:p>
     <w:p>
       <w:pPr>
-        <w:spacing w:line="300" w:lineRule="auto" w:after="40"/>
-        <w:ind w:firstLine="576"/>
+        <w:spacing w:line="360" w:lineRule="auto" w:after="40"/>
+        <w:ind w:firstLine="720"/>
         <w:jc w:val="both"/>
       </w:pPr>
       <w:r>
@@ -11722,8 +11841,8 @@
     </w:p>
     <w:p>
       <w:pPr>
-        <w:spacing w:line="300" w:lineRule="auto" w:after="40"/>
-        <w:ind w:firstLine="576"/>
+        <w:spacing w:line="360" w:lineRule="auto" w:after="40"/>
+        <w:ind w:firstLine="720"/>
         <w:jc w:val="both"/>
       </w:pPr>
       <w:r>
@@ -11751,8 +11870,8 @@
     </w:p>
     <w:p>
       <w:pPr>
-        <w:spacing w:line="300" w:lineRule="auto" w:after="40"/>
-        <w:ind w:firstLine="576"/>
+        <w:spacing w:line="360" w:lineRule="auto" w:after="40"/>
+        <w:ind w:firstLine="720"/>
         <w:jc w:val="both"/>
       </w:pPr>
       <w:r>
@@ -11760,7 +11879,7 @@
           <w:rFonts w:ascii="Times New Roman" w:hAnsi="Times New Roman"/>
           <w:sz w:val="24"/>
         </w:rPr>
-        <w:t>To maintain strict scientific honesty, software test results and physical hardware validation are explicitly separated. Physical hardware validation confirms electrical and acoustic functionality on the assembled prototype (Table 9).</w:t>
+        <w:t>To maintain strict scientific honesty, software test results and physical hardware validation are explicitly separated. While the firmware and circuit design implement all physical hardware controls, saved physical test evidence (such as oscilloscope recordings, physical serial captures, and physical audio archives) was not recorded in the repository. Synthetic VXF1 tests verify the protocol logic in software, but physical hardware evidence was not recorded (Table 9).</w:t>
       </w:r>
     </w:p>
     <w:p>
@@ -11776,7 +11895,7 @@
           <w:b/>
           <w:sz w:val="20"/>
         </w:rPr>
-        <w:t>Table 9. Physical Hardware Validation Status</w:t>
+        <w:t>Table 9. Physical Hardware Implementation and Evidence Status</w:t>
       </w:r>
     </w:p>
     <w:tbl>
@@ -11822,13 +11941,13 @@
                 <w:b/>
                 <w:sz w:val="18"/>
               </w:rPr>
-              <w:t>Validation Check</w:t>
+              <w:t>Hardware Subsystem</w:t>
             </w:r>
           </w:p>
         </w:tc>
         <w:tc>
           <w:tcPr>
-            <w:tcW w:type="dxa" w:w="4896"/>
+            <w:tcW w:type="dxa" w:w="3600"/>
             <w:shd w:fill="E8EEF5"/>
             <w:tcMar>
               <w:top w:w="50" w:type="dxa"/>
@@ -11849,13 +11968,13 @@
                 <w:b/>
                 <w:sz w:val="18"/>
               </w:rPr>
-              <w:t>Procedure &amp; What Was Checked</w:t>
+              <w:t>Design &amp; Implementation Detail</w:t>
             </w:r>
           </w:p>
         </w:tc>
         <w:tc>
           <w:tcPr>
-            <w:tcW w:type="dxa" w:w="1440"/>
+            <w:tcW w:type="dxa" w:w="3024"/>
             <w:shd w:fill="E8EEF5"/>
             <w:tcMar>
               <w:top w:w="50" w:type="dxa"/>
@@ -11876,7 +11995,7 @@
                 <w:b/>
                 <w:sz w:val="18"/>
               </w:rPr>
-              <w:t>Hardware Status</w:t>
+              <w:t>Evidence Status in Repository</w:t>
             </w:r>
           </w:p>
         </w:tc>
@@ -11909,7 +12028,7 @@
         </w:tc>
         <w:tc>
           <w:tcPr>
-            <w:tcW w:type="dxa" w:w="4896"/>
+            <w:tcW w:type="dxa" w:w="3600"/>
             <w:tcMar>
               <w:top w:w="40" w:type="dxa"/>
               <w:bottom w:w="40" w:type="dxa"/>
@@ -11928,13 +12047,13 @@
                 <w:rFonts w:ascii="Times New Roman" w:hAnsi="Times New Roman"/>
                 <w:sz w:val="17"/>
               </w:rPr>
-              <w:t>Verified 512 kHz SCK and 16 kHz WS frame sync on GPIO26/GPIO25</w:t>
+              <w:t>Firmware configures 512 kHz SCK and 16 kHz WS frame sync on GPIO26/GPIO25</w:t>
             </w:r>
           </w:p>
         </w:tc>
         <w:tc>
           <w:tcPr>
-            <w:tcW w:type="dxa" w:w="1440"/>
+            <w:tcW w:type="dxa" w:w="3024"/>
             <w:tcMar>
               <w:top w:w="40" w:type="dxa"/>
               <w:bottom w:w="40" w:type="dxa"/>
@@ -11953,7 +12072,7 @@
                 <w:rFonts w:ascii="Times New Roman" w:hAnsi="Times New Roman"/>
                 <w:sz w:val="17"/>
               </w:rPr>
-              <w:t>VERIFIED</w:t>
+              <w:t>Implemented in firmware; physical evidence not recorded</w:t>
             </w:r>
           </w:p>
         </w:tc>
@@ -11987,7 +12106,7 @@
         </w:tc>
         <w:tc>
           <w:tcPr>
-            <w:tcW w:type="dxa" w:w="4896"/>
+            <w:tcW w:type="dxa" w:w="3600"/>
             <w:shd w:fill="F9FAFB"/>
             <w:tcMar>
               <w:top w:w="40" w:type="dxa"/>
@@ -12007,13 +12126,13 @@
                 <w:rFonts w:ascii="Times New Roman" w:hAnsi="Times New Roman"/>
                 <w:sz w:val="17"/>
               </w:rPr>
-              <w:t>Recorded spoken speech with INMP441; verified clean 16 kHz PCM waveform</w:t>
+              <w:t>INMP441 wired to ESP32 I2S pins for 16 kHz 16-bit mono PCM capture</w:t>
             </w:r>
           </w:p>
         </w:tc>
         <w:tc>
           <w:tcPr>
-            <w:tcW w:type="dxa" w:w="1440"/>
+            <w:tcW w:type="dxa" w:w="3024"/>
             <w:shd w:fill="F9FAFB"/>
             <w:tcMar>
               <w:top w:w="40" w:type="dxa"/>
@@ -12033,7 +12152,7 @@
                 <w:rFonts w:ascii="Times New Roman" w:hAnsi="Times New Roman"/>
                 <w:sz w:val="17"/>
               </w:rPr>
-              <w:t>VERIFIED</w:t>
+              <w:t>Implemented in hardware design; physical evidence not recorded</w:t>
             </w:r>
           </w:p>
         </w:tc>
@@ -12066,7 +12185,7 @@
         </w:tc>
         <w:tc>
           <w:tcPr>
-            <w:tcW w:type="dxa" w:w="4896"/>
+            <w:tcW w:type="dxa" w:w="3600"/>
             <w:tcMar>
               <w:top w:w="40" w:type="dxa"/>
               <w:bottom w:w="40" w:type="dxa"/>
@@ -12085,13 +12204,13 @@
                 <w:rFonts w:ascii="Times New Roman" w:hAnsi="Times New Roman"/>
                 <w:sz w:val="17"/>
               </w:rPr>
-              <w:t>Streamed audio at 460,800 baud over USB-UART with zero dropped frames</w:t>
+              <w:t>Protocol logic checks CRC32 checksums and sequential sequence numbers</w:t>
             </w:r>
           </w:p>
         </w:tc>
         <w:tc>
           <w:tcPr>
-            <w:tcW w:type="dxa" w:w="1440"/>
+            <w:tcW w:type="dxa" w:w="3024"/>
             <w:tcMar>
               <w:top w:w="40" w:type="dxa"/>
               <w:bottom w:w="40" w:type="dxa"/>
@@ -12110,7 +12229,7 @@
                 <w:rFonts w:ascii="Times New Roman" w:hAnsi="Times New Roman"/>
                 <w:sz w:val="17"/>
               </w:rPr>
-              <w:t>VERIFIED</w:t>
+              <w:t>Verified in software/synthetic tests; physical logs not recorded</w:t>
             </w:r>
           </w:p>
         </w:tc>
@@ -12144,7 +12263,7 @@
         </w:tc>
         <w:tc>
           <w:tcPr>
-            <w:tcW w:type="dxa" w:w="4896"/>
+            <w:tcW w:type="dxa" w:w="3600"/>
             <w:shd w:fill="F9FAFB"/>
             <w:tcMar>
               <w:top w:w="40" w:type="dxa"/>
@@ -12164,13 +12283,13 @@
                 <w:rFonts w:ascii="Times New Roman" w:hAnsi="Times New Roman"/>
                 <w:sz w:val="17"/>
               </w:rPr>
-              <w:t>Tested physical push buttons on GPIO27 and GPIO33 for session control</w:t>
+              <w:t>Active LOW buttons on GPIO27 and GPIO33 implemented with internal pull-ups</w:t>
             </w:r>
           </w:p>
         </w:tc>
         <w:tc>
           <w:tcPr>
-            <w:tcW w:type="dxa" w:w="1440"/>
+            <w:tcW w:type="dxa" w:w="3024"/>
             <w:shd w:fill="F9FAFB"/>
             <w:tcMar>
               <w:top w:w="40" w:type="dxa"/>
@@ -12190,7 +12309,7 @@
                 <w:rFonts w:ascii="Times New Roman" w:hAnsi="Times New Roman"/>
                 <w:sz w:val="17"/>
               </w:rPr>
-              <w:t>VERIFIED</w:t>
+              <w:t>Implemented in firmware; physical evidence not recorded</w:t>
             </w:r>
           </w:p>
         </w:tc>
@@ -12223,7 +12342,7 @@
         </w:tc>
         <w:tc>
           <w:tcPr>
-            <w:tcW w:type="dxa" w:w="4896"/>
+            <w:tcW w:type="dxa" w:w="3600"/>
             <w:tcMar>
               <w:top w:w="40" w:type="dxa"/>
               <w:bottom w:w="40" w:type="dxa"/>
@@ -12242,13 +12361,13 @@
                 <w:rFonts w:ascii="Times New Roman" w:hAnsi="Times New Roman"/>
                 <w:sz w:val="17"/>
               </w:rPr>
-              <w:t>Verified solid standby light and 2 Hz blinking during active recording</w:t>
+              <w:t>GPIO4 pin drive logic (solid standby, 2 Hz blinking during recording)</w:t>
             </w:r>
           </w:p>
         </w:tc>
         <w:tc>
           <w:tcPr>
-            <w:tcW w:type="dxa" w:w="1440"/>
+            <w:tcW w:type="dxa" w:w="3024"/>
             <w:tcMar>
               <w:top w:w="40" w:type="dxa"/>
               <w:bottom w:w="40" w:type="dxa"/>
@@ -12267,7 +12386,7 @@
                 <w:rFonts w:ascii="Times New Roman" w:hAnsi="Times New Roman"/>
                 <w:sz w:val="17"/>
               </w:rPr>
-              <w:t>VERIFIED</w:t>
+              <w:t>Implemented in firmware; physical evidence not recorded</w:t>
             </w:r>
           </w:p>
         </w:tc>
@@ -12301,7 +12420,7 @@
         </w:tc>
         <w:tc>
           <w:tcPr>
-            <w:tcW w:type="dxa" w:w="4896"/>
+            <w:tcW w:type="dxa" w:w="3600"/>
             <w:shd w:fill="F9FAFB"/>
             <w:tcMar>
               <w:top w:w="40" w:type="dxa"/>
@@ -12321,13 +12440,13 @@
                 <w:rFonts w:ascii="Times New Roman" w:hAnsi="Times New Roman"/>
                 <w:sz w:val="17"/>
               </w:rPr>
-              <w:t>Verified firmware auto-terminates at 960,000 samples and sends terminal frame</w:t>
+              <w:t>Firmware enforces 960,000-sample limit and sends terminal frame</w:t>
             </w:r>
           </w:p>
         </w:tc>
         <w:tc>
           <w:tcPr>
-            <w:tcW w:type="dxa" w:w="1440"/>
+            <w:tcW w:type="dxa" w:w="3024"/>
             <w:shd w:fill="F9FAFB"/>
             <w:tcMar>
               <w:top w:w="40" w:type="dxa"/>
@@ -12347,7 +12466,7 @@
                 <w:rFonts w:ascii="Times New Roman" w:hAnsi="Times New Roman"/>
                 <w:sz w:val="17"/>
               </w:rPr>
-              <w:t>VERIFIED</w:t>
+              <w:t>Implemented in firmware; physical evidence not recorded</w:t>
             </w:r>
           </w:p>
         </w:tc>
@@ -12370,8 +12489,8 @@
     </w:p>
     <w:p>
       <w:pPr>
-        <w:spacing w:line="300" w:lineRule="auto" w:after="40"/>
-        <w:ind w:firstLine="576"/>
+        <w:spacing w:line="360" w:lineRule="auto" w:after="40"/>
+        <w:ind w:firstLine="720"/>
         <w:jc w:val="both"/>
       </w:pPr>
       <w:r>
@@ -12384,8 +12503,8 @@
     </w:p>
     <w:p>
       <w:pPr>
-        <w:spacing w:line="300" w:lineRule="auto" w:after="20"/>
-        <w:ind w:left="504" w:hanging="288"/>
+        <w:spacing w:line="360" w:lineRule="auto" w:after="20"/>
+        <w:ind w:left="720" w:hanging="360"/>
         <w:jc w:val="both"/>
       </w:pPr>
       <w:r>
@@ -12414,8 +12533,8 @@
     </w:p>
     <w:p>
       <w:pPr>
-        <w:spacing w:line="300" w:lineRule="auto" w:after="20"/>
-        <w:ind w:left="504" w:hanging="288"/>
+        <w:spacing w:line="360" w:lineRule="auto" w:after="20"/>
+        <w:ind w:left="720" w:hanging="360"/>
         <w:jc w:val="both"/>
       </w:pPr>
       <w:r>
@@ -12444,8 +12563,8 @@
     </w:p>
     <w:p>
       <w:pPr>
-        <w:spacing w:line="300" w:lineRule="auto" w:after="20"/>
-        <w:ind w:left="504" w:hanging="288"/>
+        <w:spacing w:line="360" w:lineRule="auto" w:after="20"/>
+        <w:ind w:left="720" w:hanging="360"/>
         <w:jc w:val="both"/>
       </w:pPr>
       <w:r>
@@ -12474,8 +12593,8 @@
     </w:p>
     <w:p>
       <w:pPr>
-        <w:spacing w:line="300" w:lineRule="auto" w:after="20"/>
-        <w:ind w:left="504" w:hanging="288"/>
+        <w:spacing w:line="360" w:lineRule="auto" w:after="20"/>
+        <w:ind w:left="720" w:hanging="360"/>
         <w:jc w:val="both"/>
       </w:pPr>
       <w:r>
@@ -12504,8 +12623,8 @@
     </w:p>
     <w:p>
       <w:pPr>
-        <w:spacing w:line="300" w:lineRule="auto" w:after="20"/>
-        <w:ind w:left="504" w:hanging="288"/>
+        <w:spacing w:line="360" w:lineRule="auto" w:after="20"/>
+        <w:ind w:left="720" w:hanging="360"/>
         <w:jc w:val="both"/>
       </w:pPr>
       <w:r>
@@ -12534,8 +12653,8 @@
     </w:p>
     <w:p>
       <w:pPr>
-        <w:spacing w:line="300" w:lineRule="auto" w:after="20"/>
-        <w:ind w:left="504" w:hanging="288"/>
+        <w:spacing w:line="360" w:lineRule="auto" w:after="20"/>
+        <w:ind w:left="720" w:hanging="360"/>
         <w:jc w:val="both"/>
       </w:pPr>
       <w:r>
@@ -12564,8 +12683,8 @@
     </w:p>
     <w:p>
       <w:pPr>
-        <w:spacing w:line="300" w:lineRule="auto" w:after="20"/>
-        <w:ind w:left="504" w:hanging="288"/>
+        <w:spacing w:line="360" w:lineRule="auto" w:after="20"/>
+        <w:ind w:left="720" w:hanging="360"/>
         <w:jc w:val="both"/>
       </w:pPr>
       <w:r>
@@ -12589,13 +12708,13 @@
           <w:rFonts w:ascii="Times New Roman" w:hAnsi="Times New Roman"/>
           <w:sz w:val="24"/>
         </w:rPr>
-        <w:t>The bridge posts the WAV to /api/v1/session/analyze, triggering windowing and HuBERT-D inference.</w:t>
+        <w:t>The bridge posts the WAV to /api/v1/session/&lt;session_id&gt;/analyze, triggering windowing and HuBERT-D inference.</w:t>
       </w:r>
     </w:p>
     <w:p>
       <w:pPr>
-        <w:spacing w:line="300" w:lineRule="auto" w:after="20"/>
-        <w:ind w:left="504" w:hanging="288"/>
+        <w:spacing w:line="360" w:lineRule="auto" w:after="20"/>
+        <w:ind w:left="720" w:hanging="360"/>
         <w:jc w:val="both"/>
       </w:pPr>
       <w:r>
@@ -12619,13 +12738,13 @@
           <w:rFonts w:ascii="Times New Roman" w:hAnsi="Times New Roman"/>
           <w:sz w:val="24"/>
         </w:rPr>
-        <w:t>Overlapping positive windows are merged into non-redundant clinical disfluency events.</w:t>
+        <w:t>Overlapping positive windows are merged into detected disfluency events.</w:t>
       </w:r>
     </w:p>
     <w:p>
       <w:pPr>
-        <w:spacing w:line="300" w:lineRule="auto" w:after="20"/>
-        <w:ind w:left="504" w:hanging="288"/>
+        <w:spacing w:line="360" w:lineRule="auto" w:after="20"/>
+        <w:ind w:left="720" w:hanging="360"/>
         <w:jc w:val="both"/>
       </w:pPr>
       <w:r>
@@ -12654,8 +12773,8 @@
     </w:p>
     <w:p>
       <w:pPr>
-        <w:spacing w:line="300" w:lineRule="auto" w:after="20"/>
-        <w:ind w:left="504" w:hanging="288"/>
+        <w:spacing w:line="360" w:lineRule="auto" w:after="20"/>
+        <w:ind w:left="720" w:hanging="360"/>
         <w:jc w:val="both"/>
       </w:pPr>
       <w:r>
@@ -12672,7 +12791,7 @@
           <w:b/>
           <w:sz w:val="24"/>
         </w:rPr>
-        <w:t xml:space="preserve">Step 10 (Clinical Review): </w:t>
+        <w:t xml:space="preserve">Step 10 (Session Review): </w:t>
       </w:r>
       <w:r>
         <w:rPr>
@@ -12699,8 +12818,8 @@
     </w:p>
     <w:p>
       <w:pPr>
-        <w:spacing w:line="300" w:lineRule="auto" w:after="40"/>
-        <w:ind w:firstLine="576"/>
+        <w:spacing w:line="360" w:lineRule="auto" w:after="40"/>
+        <w:ind w:firstLine="720"/>
         <w:jc w:val="both"/>
       </w:pPr>
       <w:r>
@@ -12708,7 +12827,7 @@
           <w:rFonts w:ascii="Times New Roman" w:hAnsi="Times New Roman"/>
           <w:sz w:val="24"/>
         </w:rPr>
-        <w:t>The deployment model operates entirely on-premise on the host workstation connected to the ESP32 capture unit via USB-UART (as shown in the Deployment Diagram, Fig. 8). The software stack requires no active internet connection or cloud runtime dependencies, ensuring total patient privacy, HIPAA compliance compatibility, zero cloud service costs, and deterministic sub-second processing latency.</w:t>
+        <w:t>The deployment model operates entirely on-premise on the host workstation connected to the ESP32 capture unit via USB-UART (as shown in the Deployment Diagram, Fig. 8). The software stack requires no active internet connection or cloud runtime dependencies. Processing executes locally on PC hardware, ensuring that all audio data remains on the local system without cloud service fees. VoxFlow is a research prototype and is not a medical diagnostic system.</w:t>
       </w:r>
     </w:p>
     <w:p>
@@ -12743,8 +12862,8 @@
     </w:p>
     <w:p>
       <w:pPr>
-        <w:spacing w:line="300" w:lineRule="auto" w:after="40"/>
-        <w:ind w:firstLine="576"/>
+        <w:spacing w:line="360" w:lineRule="auto" w:after="40"/>
+        <w:ind w:firstLine="720"/>
         <w:jc w:val="both"/>
       </w:pPr>
       <w:r>
@@ -13526,8 +13645,8 @@
     </w:tbl>
     <w:p>
       <w:pPr>
-        <w:spacing w:line="300" w:lineRule="auto" w:after="40"/>
-        <w:ind w:firstLine="576"/>
+        <w:spacing w:line="360" w:lineRule="auto" w:after="40"/>
+        <w:ind w:firstLine="720"/>
         <w:jc w:val="both"/>
       </w:pPr>
       <w:r>
@@ -13535,7 +13654,7 @@
           <w:rFonts w:ascii="Times New Roman" w:hAnsi="Times New Roman"/>
           <w:sz w:val="24"/>
         </w:rPr>
-        <w:t>A granular analysis of HuBERT-D per-class performance reveals that Repetition detection achieved the highest F1 score (0.5565), followed by Prolongation (0.4841), while Block detection remained the most challenging class (0.3393). This pattern aligns with clinical reality: repetitions and prolongations exhibit salient acoustic and phonetic cues (rhythmic repetition and sustained formants), whereas blocks are characterized by silent postural fixations that are acoustically difficult to distinguish from natural conversational pauses.</w:t>
+        <w:t>A granular analysis of HuBERT-D per-class performance reveals that Repetition detection achieved the highest F1 score (0.5565), followed by Prolongation (0.4841), while Block detection remained the most challenging class (0.3393). This pattern aligns with acoustic characteristics: repetitions and prolongations exhibit salient acoustic and phonetic cues (rhythmic repetition and sustained formants), whereas blocks are characterized by silent postural fixations that are acoustically difficult to distinguish from natural conversational pauses.</w:t>
       </w:r>
     </w:p>
     <w:p>
@@ -13555,8 +13674,8 @@
     </w:p>
     <w:p>
       <w:pPr>
-        <w:spacing w:line="300" w:lineRule="auto" w:after="40"/>
-        <w:ind w:firstLine="576"/>
+        <w:spacing w:line="360" w:lineRule="auto" w:after="40"/>
+        <w:ind w:firstLine="720"/>
         <w:jc w:val="both"/>
       </w:pPr>
       <w:r>
@@ -13564,7 +13683,7 @@
           <w:rFonts w:ascii="Times New Roman" w:hAnsi="Times New Roman"/>
           <w:sz w:val="24"/>
         </w:rPr>
-        <w:t>Session processing tests confirm that sliding-window analysis paired with temporal event aggregation correctly measures continuous speech sessions. Slicing a 10-second speech recording produces 8 windows; when simulated repetitions occur across windows 2, 3, and 4 (timestamps 1.0s to 6.0s), the temporal aggregator consolidates the 3 positive windows into exactly 1 unified clinical event spanning from 1.0s to 6.0s with peak confidence. This verifies that event consolidation prevents artificial inflation of clinical disfluency counts.</w:t>
+        <w:t>Session processing tests confirm that sliding-window analysis paired with temporal event aggregation correctly measures continuous speech sessions. Slicing a 10-second speech recording produces 8 windows; when simulated repetitions occur across windows 2, 3, and 4 (timestamps 1.0s to 6.0s), the temporal aggregator consolidates the 3 positive windows into exactly 1 unified detected event spanning from 1.0s to 6.0s with peak confidence. This verifies that event consolidation prevents artificial inflation of disfluency counts.</w:t>
       </w:r>
     </w:p>
     <w:p>
@@ -13584,8 +13703,8 @@
     </w:p>
     <w:p>
       <w:pPr>
-        <w:spacing w:line="300" w:lineRule="auto" w:after="40"/>
-        <w:ind w:firstLine="576"/>
+        <w:spacing w:line="360" w:lineRule="auto" w:after="40"/>
+        <w:ind w:firstLine="720"/>
         <w:jc w:val="both"/>
       </w:pPr>
       <w:r>
@@ -13628,8 +13747,8 @@
     </w:p>
     <w:p>
       <w:pPr>
-        <w:spacing w:line="300" w:lineRule="auto" w:after="40"/>
-        <w:ind w:firstLine="576"/>
+        <w:spacing w:line="360" w:lineRule="auto" w:after="40"/>
+        <w:ind w:firstLine="720"/>
         <w:jc w:val="both"/>
       </w:pPr>
       <w:r>
@@ -13642,8 +13761,8 @@
     </w:p>
     <w:p>
       <w:pPr>
-        <w:spacing w:line="300" w:lineRule="auto" w:after="20"/>
-        <w:ind w:left="504" w:hanging="288"/>
+        <w:spacing w:line="360" w:lineRule="auto" w:after="20"/>
+        <w:ind w:left="720" w:hanging="360"/>
         <w:jc w:val="both"/>
       </w:pPr>
       <w:r>
@@ -13672,8 +13791,8 @@
     </w:p>
     <w:p>
       <w:pPr>
-        <w:spacing w:line="300" w:lineRule="auto" w:after="20"/>
-        <w:ind w:left="504" w:hanging="288"/>
+        <w:spacing w:line="360" w:lineRule="auto" w:after="20"/>
+        <w:ind w:left="720" w:hanging="360"/>
         <w:jc w:val="both"/>
       </w:pPr>
       <w:r>
@@ -13702,8 +13821,8 @@
     </w:p>
     <w:p>
       <w:pPr>
-        <w:spacing w:line="300" w:lineRule="auto" w:after="20"/>
-        <w:ind w:left="504" w:hanging="288"/>
+        <w:spacing w:line="360" w:lineRule="auto" w:after="20"/>
+        <w:ind w:left="720" w:hanging="360"/>
         <w:jc w:val="both"/>
       </w:pPr>
       <w:r>
@@ -13727,7 +13846,7 @@
           <w:rFonts w:ascii="Times New Roman" w:hAnsi="Times New Roman"/>
           <w:sz w:val="24"/>
         </w:rPr>
-        <w:t>The prototype is designed for a single workstation without multi-user authentication or role-based clinical access control.</w:t>
+        <w:t>The prototype is designed for a single workstation without multi-user authentication or role-based access control.</w:t>
       </w:r>
     </w:p>
     <w:p>
@@ -13747,8 +13866,8 @@
     </w:p>
     <w:p>
       <w:pPr>
-        <w:spacing w:line="300" w:lineRule="auto" w:after="40"/>
-        <w:ind w:firstLine="576"/>
+        <w:spacing w:line="360" w:lineRule="auto" w:after="40"/>
+        <w:ind w:firstLine="720"/>
         <w:jc w:val="both"/>
       </w:pPr>
       <w:r>
@@ -13761,8 +13880,8 @@
     </w:p>
     <w:p>
       <w:pPr>
-        <w:spacing w:line="300" w:lineRule="auto" w:after="20"/>
-        <w:ind w:left="504" w:hanging="288"/>
+        <w:spacing w:line="360" w:lineRule="auto" w:after="20"/>
+        <w:ind w:left="720" w:hanging="360"/>
         <w:jc w:val="both"/>
       </w:pPr>
       <w:r>
@@ -13791,8 +13910,8 @@
     </w:p>
     <w:p>
       <w:pPr>
-        <w:spacing w:line="300" w:lineRule="auto" w:after="20"/>
-        <w:ind w:left="504" w:hanging="288"/>
+        <w:spacing w:line="360" w:lineRule="auto" w:after="20"/>
+        <w:ind w:left="720" w:hanging="360"/>
         <w:jc w:val="both"/>
       </w:pPr>
       <w:r>
@@ -13821,8 +13940,8 @@
     </w:p>
     <w:p>
       <w:pPr>
-        <w:spacing w:line="300" w:lineRule="auto" w:after="20"/>
-        <w:ind w:left="504" w:hanging="288"/>
+        <w:spacing w:line="360" w:lineRule="auto" w:after="20"/>
+        <w:ind w:left="720" w:hanging="360"/>
         <w:jc w:val="both"/>
       </w:pPr>
       <w:r>
@@ -13839,20 +13958,20 @@
           <w:b/>
           <w:sz w:val="24"/>
         </w:rPr>
-        <w:t xml:space="preserve">Clinical Pilot Trials: </w:t>
+        <w:t xml:space="preserve">Therapy Usability Studies: </w:t>
       </w:r>
       <w:r>
         <w:rPr>
           <w:rFonts w:ascii="Times New Roman" w:hAnsi="Times New Roman"/>
           <w:sz w:val="24"/>
         </w:rPr>
-        <w:t>Conduct formal clinical validation studies in collaboration with speech-language pathologists to assess usability and clinical utility in real therapeutic practice.</w:t>
+        <w:t>Conduct formal usability studies in collaboration with speech therapists to assess workflow utility in practical sessions.</w:t>
       </w:r>
     </w:p>
     <w:p>
       <w:pPr>
-        <w:spacing w:line="300" w:lineRule="auto" w:after="20"/>
-        <w:ind w:left="504" w:hanging="288"/>
+        <w:spacing w:line="360" w:lineRule="auto" w:after="20"/>
+        <w:ind w:left="720" w:hanging="360"/>
         <w:jc w:val="both"/>
       </w:pPr>
       <w:r>
@@ -13896,8 +14015,8 @@
     </w:p>
     <w:p>
       <w:pPr>
-        <w:spacing w:line="300" w:lineRule="auto" w:after="40"/>
-        <w:ind w:firstLine="576"/>
+        <w:spacing w:line="360" w:lineRule="auto" w:after="40"/>
+        <w:ind w:firstLine="720"/>
         <w:jc w:val="both"/>
       </w:pPr>
       <w:r>
@@ -13905,13 +14024,13 @@
           <w:rFonts w:ascii="Times New Roman" w:hAnsi="Times New Roman"/>
           <w:sz w:val="24"/>
         </w:rPr>
-        <w:t>In this project, we designed, implemented, and verified VoxFlow, an end-to-end speech fluency and disfluency session analyzer. VoxFlow bridges the gap between theoretical machine learning clip classification and practical clinical session assessment by uniting low-cost embedded hardware capture (ESP32 + INMP441), an error-checked serial protocol (VXF1 with CRC32 verification), self-supervised deep learning modeling (HuBERT-D), algorithmic temporal event aggregation, relational SQLite persistence, and an interactive Streamlit visual analytics dashboard.</w:t>
+        <w:t>In this project, we designed, implemented, and verified VoxFlow, an end-to-end speech fluency and disfluency session analyzer. VoxFlow bridges the gap between theoretical machine learning clip classification and practical session assessment by uniting low-cost embedded hardware capture (ESP32 + INMP441), an error-checked serial protocol (VXF1 with CRC32 verification), self-supervised deep learning modeling (HuBERT-D), algorithmic temporal event aggregation, relational SQLite persistence, and an interactive Streamlit visual analytics dashboard.</w:t>
       </w:r>
     </w:p>
     <w:p>
       <w:pPr>
-        <w:spacing w:line="300" w:lineRule="auto" w:after="40"/>
-        <w:ind w:firstLine="576"/>
+        <w:spacing w:line="360" w:lineRule="auto" w:after="40"/>
+        <w:ind w:firstLine="720"/>
         <w:jc w:val="both"/>
       </w:pPr>
       <w:r>
@@ -13919,7 +14038,7 @@
           <w:rFonts w:ascii="Times New Roman" w:hAnsi="Times New Roman"/>
           <w:sz w:val="24"/>
         </w:rPr>
-        <w:t>Evaluated under strict speaker-exclusive constraints across 519 distinct speakers, HuBERT-D achieved a Macro F1 score of 0.4599 and a Mean ROC-AUC of 0.8099 on unseen voices, outperforming wav2vec 2.0 (0.4498) and an MFCC + SVM baseline (0.3121). The temporal event aggregator successfully consolidates overlapping sliding-window detections into bounded clinical events, eliminating redundant multi-counting. The entire software suite passes all 38 automated unit and integration tests. Operating entirely on local PC hardware without cloud runtime dependencies, VoxFlow provides an accessible, privacy-preserving, and scientifically grounded tool for automated speech fluency analysis.</w:t>
+        <w:t>Evaluated under strict speaker-exclusive constraints across 519 distinct speakers, HuBERT-D achieved a Macro F1 score of 0.4599 and a Mean ROC-AUC of 0.8099 on unseen voices, outperforming wav2vec 2.0 (0.4498) and an MFCC + SVM baseline (0.3121). The temporal event aggregator successfully consolidates overlapping sliding-window detections into bounded detected events, eliminating redundant multi-counting. The entire software suite passes all 38 automated unit and integration tests. Operating entirely on local PC hardware without cloud runtime dependencies, VoxFlow provides an accessible, privacy-preserving, and scientifically grounded tool for automated speech fluency analysis. VoxFlow is a research prototype and is not a medical diagnostic system.</w:t>
       </w:r>
     </w:p>
     <w:p>
@@ -15126,8 +15245,8 @@
     </w:p>
     <w:p>
       <w:pPr>
-        <w:spacing w:line="300" w:lineRule="auto" w:after="40"/>
-        <w:ind w:firstLine="576"/>
+        <w:spacing w:line="360" w:lineRule="auto" w:after="40"/>
+        <w:ind w:firstLine="720"/>
         <w:jc w:val="both"/>
       </w:pPr>
       <w:r>
@@ -15140,8 +15259,8 @@
     </w:p>
     <w:p>
       <w:pPr>
-        <w:spacing w:line="300" w:lineRule="auto" w:after="40"/>
-        <w:ind w:firstLine="576"/>
+        <w:spacing w:line="360" w:lineRule="auto" w:after="40"/>
+        <w:ind w:firstLine="720"/>
         <w:jc w:val="both"/>
       </w:pPr>
       <w:r>
@@ -15149,7 +15268,7 @@
           <w:rFonts w:ascii="Times New Roman" w:hAnsi="Times New Roman"/>
           <w:sz w:val="24"/>
         </w:rPr>
-        <w:t>Hardware validation assets (oscilloscope clock verification, physical push button triggering, status LED blinking, and 60-second automatic limit enforcement) are verified on the physical prototype.</w:t>
+        <w:t>Hardware implementation assets (pin wiring, button triggers, LED indication, and 60-second limit logic) are implemented in the firmware and circuit schematic. Formal physical evidence (oscilloscope traces, physical button press logs, optical LED recordings, and hardware audio session logs) was not recorded in the repository.</w:t>
       </w:r>
     </w:p>
     <w:p>
@@ -15169,8 +15288,8 @@
     </w:p>
     <w:p>
       <w:pPr>
-        <w:spacing w:line="300" w:lineRule="auto" w:after="40"/>
-        <w:ind w:firstLine="576"/>
+        <w:spacing w:line="360" w:lineRule="auto" w:after="40"/>
+        <w:ind w:firstLine="720"/>
         <w:jc w:val="both"/>
       </w:pPr>
       <w:r>
@@ -15574,7 +15693,7 @@
     <w:qFormat/>
     <w:rsid w:val="00FC693F"/>
     <w:pPr>
-      <w:spacing w:line="312" w:lineRule="auto" w:after="40"/>
+      <w:spacing w:line="360" w:lineRule="auto" w:after="40"/>
       <w:jc w:val="both"/>
     </w:pPr>
     <w:rPr>

</xml_diff>